<commit_message>
fix(k2-rmk): apply two-stage review findings (fidelity clean; language polish)
Co-Authored-By: Claude Sonnet 4.6 <noreply@anthropic.com>
</commit_message>
<xml_diff>
--- a/Kelompok 2 Pasca UTS/output/Kelompok 2_RMK Chapter 13 Statement of Cash Flows.docx
+++ b/Kelompok 2 Pasca UTS/output/Kelompok 2_RMK Chapter 13 Statement of Cash Flows.docx
@@ -432,7 +432,7 @@
           <w:i w:val="0"/>
           <w:sz w:val="24"/>
         </w:rPr>
-        <w:t xml:space="preserve">Untuk memahami posisi laporan arus kas dalam pelaporan keuangan modern, perlu ditelusuri arc sejarah yang menjembataninya. Pada tahun 1971, </w:t>
+        <w:t xml:space="preserve">Untuk memahami posisi laporan arus kas dalam pelaporan keuangan modern, perlu ditelusuri alur sejarah yang menjembataninya. Pada tahun 1971, </w:t>
       </w:r>
       <w:r>
         <w:rPr>
@@ -954,7 +954,7 @@
           <w:i w:val="0"/>
           <w:sz w:val="24"/>
         </w:rPr>
-        <w:t>penggunaan daya</w:t>
+        <w:t>penggunaan sumber daya</w:t>
       </w:r>
       <w:r>
         <w:rPr>
@@ -1068,7 +1068,25 @@
           <w:i w:val="0"/>
           <w:sz w:val="24"/>
         </w:rPr>
-        <w:t xml:space="preserve">). Transaksi tambahan ini mencakup aktivitas investasi dan pendanaan yang tidak menyentuh akun dana — misalnya konversi utang konversi menjadi saham biasa, penerbitan saham untuk memperoleh aset nonmoneter, pembayaran dividen dalam bentuk properti alih-alih kas, serta pertukaran aset nonmoneter. APB Opinion No. 19 memilih pendekatan </w:t>
+        <w:t xml:space="preserve">). Transaksi tambahan ini mencakup aktivitas investasi dan pendanaan yang tidak menyentuh akun dana — misalnya konversi </w:t>
+      </w:r>
+      <w:r>
+        <w:rPr>
+          <w:rFonts w:ascii="Times New Roman" w:hAnsi="Times New Roman" w:cs="Times New Roman"/>
+          <w:b w:val="0"/>
+          <w:i/>
+          <w:sz w:val="24"/>
+        </w:rPr>
+        <w:t>utang konvertibel</w:t>
+      </w:r>
+      <w:r>
+        <w:rPr>
+          <w:rFonts w:ascii="Times New Roman" w:hAnsi="Times New Roman" w:cs="Times New Roman"/>
+          <w:b w:val="0"/>
+          <w:i w:val="0"/>
+          <w:sz w:val="24"/>
+        </w:rPr>
+        <w:t xml:space="preserve"> menjadi saham biasa, penerbitan saham untuk memperoleh aset nonmoneter, pembayaran dividen dalam bentuk properti alih-alih kas, serta pertukaran aset nonmoneter. APB Opinion No. 19 memilih pendekatan </w:t>
       </w:r>
       <w:r>
         <w:rPr>
@@ -1279,7 +1297,25 @@
           <w:i w:val="0"/>
           <w:sz w:val="24"/>
         </w:rPr>
-        <w:t xml:space="preserve">Dalam semua kasus, seluruh transaksi yang tidak memengaruhi akun dana tetap harus dimasukkan ke dalam SCFP, meskipun tidak berdampak langsung pada akun dana (Wolk et al., 2017, PDF hlm. 4). Pilihan definisi ini bukan tanpa konsekuensi biaya. Ketika dana didefinisikan sebagai modal kerja, transaksi non-dana yang harus dilaporkan terbatas pada transaksi nonmoneter (pertukaran nonmoneter dan konversi utang konversi menjadi saham biasa). Sebaliknya, mendefinisikan dana sebagai kas justru menambah kerumitan karena banyak transaksi tidak memengaruhi kas sehingga makin banyak transaksi non-dana yang harus dilaporkan terpisah. Definisi modal kerja meminimalkan biaya penyusunan SCFP, dan karena itulah </w:t>
+        <w:t xml:space="preserve">Dalam semua kasus, seluruh transaksi yang tidak memengaruhi akun dana tetap harus dimasukkan ke dalam SCFP, meskipun tidak berdampak langsung pada akun dana (Wolk et al., 2017, PDF hlm. 4). Pilihan definisi ini bukan tanpa konsekuensi biaya. Ketika dana didefinisikan sebagai modal kerja, transaksi non-dana yang harus dilaporkan terbatas pada transaksi nonmoneter (pertukaran nonmoneter dan konversi </w:t>
+      </w:r>
+      <w:r>
+        <w:rPr>
+          <w:rFonts w:ascii="Times New Roman" w:hAnsi="Times New Roman" w:cs="Times New Roman"/>
+          <w:b w:val="0"/>
+          <w:i/>
+          <w:sz w:val="24"/>
+        </w:rPr>
+        <w:t>utang konvertibel</w:t>
+      </w:r>
+      <w:r>
+        <w:rPr>
+          <w:rFonts w:ascii="Times New Roman" w:hAnsi="Times New Roman" w:cs="Times New Roman"/>
+          <w:b w:val="0"/>
+          <w:i w:val="0"/>
+          <w:sz w:val="24"/>
+        </w:rPr>
+        <w:t xml:space="preserve"> menjadi saham biasa). Sebaliknya, mendefinisikan dana sebagai kas justru menambah kerumitan karena banyak transaksi tidak memengaruhi kas sehingga makin banyak transaksi non-dana yang harus dilaporkan terpisah. Definisi modal kerja meminimalkan biaya penyusunan SCFP, dan karena itulah </w:t>
       </w:r>
       <w:r>
         <w:rPr>
@@ -2806,7 +2842,7 @@
           <w:i/>
           <w:sz w:val="24"/>
         </w:rPr>
-        <w:t xml:space="preserve">, dan penyusun laporan tampaknya dipengaruhi oleh isu biaya — preferensi yang kuat terhadap metode tidak langsung yang lebih murah disiapkan (Wolk et al., 2017, PDF hlm. 9). Persoalannya, dengan demikian, adalah persoalan biaya versus manfaat: </w:t>
+        <w:t xml:space="preserve">, dan penyusun laporan tampaknya dipengaruhi oleh isu biaya — preferensi yang kuat terhadap metode tidak langsung yang lebih murah untuk disiapkan (Wolk et al., 2017, PDF hlm. 9). Persoalannya, dengan demikian, adalah persoalan biaya versus manfaat: </w:t>
       </w:r>
       <w:r>
         <w:rPr>
@@ -3322,16 +3358,16 @@
           <w:i w:val="0"/>
           <w:sz w:val="24"/>
         </w:rPr>
-        <w:t>"business"</w:t>
-      </w:r>
-      <w:r>
-        <w:rPr>
-          <w:rFonts w:ascii="Times New Roman" w:hAnsi="Times New Roman" w:cs="Times New Roman"/>
-          <w:b w:val="0"/>
-          <w:i w:val="0"/>
-          <w:sz w:val="24"/>
-        </w:rPr>
-        <w:t>, yang berpotensi mengurangi pergeseran klasifikasi yang dilakukan manajer antara aktivitas investasi dan operasi (Wolk et al., 2017, PDF hlm. 10–11).</w:t>
+        <w:t>*"business"</w:t>
+      </w:r>
+      <w:r>
+        <w:rPr>
+          <w:rFonts w:ascii="Times New Roman" w:hAnsi="Times New Roman" w:cs="Times New Roman"/>
+          <w:b w:val="0"/>
+          <w:i w:val="0"/>
+          <w:sz w:val="24"/>
+        </w:rPr>
+        <w:t>*, yang berpotensi mengurangi pergeseran klasifikasi yang dilakukan manajer antara aktivitas investasi dan operasi (Wolk et al., 2017, PDF hlm. 10–11).</w:t>
       </w:r>
     </w:p>
     <w:p>
@@ -4813,7 +4849,7 @@
           <w:i w:val="0"/>
           <w:sz w:val="24"/>
         </w:rPr>
-        <w:t>mengapitalisasi beban yang semestinya diklasifikasikan sebagai aktivitas operasi</w:t>
+        <w:t>melakukan kapitalisasi atas beban yang semestinya diklasifikasikan sebagai aktivitas operasi</w:t>
       </w:r>
       <w:r>
         <w:rPr>
@@ -5473,7 +5509,7 @@
           <w:i w:val="0"/>
           <w:sz w:val="24"/>
         </w:rPr>
-        <w:t>. Yang elegan, sisi kedua laporan itu — arus kas bebas bagi para pemberi modal (utang berbunga dan ekuitas) — juga berakhir pada angka yang sama, $332/99/80, sehingga kedua sisi saling mengikat.</w:t>
+        <w:t>. Yang elegan di sini adalah bahwa sisi kedua laporan itu — arus kas bebas bagi para pemberi modal (utang berbunga dan ekuitas) — juga berakhir pada angka yang sama, $332/99/80, sehingga kedua sisi saling mengikat.</w:t>
       </w:r>
     </w:p>
     <w:p>
@@ -6016,7 +6052,7 @@
           <w:i w:val="0"/>
           <w:sz w:val="24"/>
         </w:rPr>
-        <w:t xml:space="preserve"> — pertanda bahwa arus kas memainkan peran yang penting dan barangkali kian besar dalam menilai kinerja serta prospek perusahaan (Wolk et al., 2017, PDF hlm. 21).</w:t>
+        <w:t xml:space="preserve"> — pertanda bahwa arus kas memainkan peran yang penting dan barangkali kian besar dalam menilai kinerja serta prospek perusahaan (Wolk et al., 2017, PDF hlm. 21) — sebuah temuan yang memperkuat seruan perbaikan yang dibahas pada bagian berikutnya.</w:t>
       </w:r>
     </w:p>
     <w:p>

</xml_diff>

<commit_message>
fix(k2-rmk): un-nest bold/italic markup that leaked literal asterisks into docx
Co-Authored-By: Claude Opus 4.8 (1M context) <noreply@anthropic.com>
</commit_message>
<xml_diff>
--- a/Kelompok 2 Pasca UTS/output/Kelompok 2_RMK Chapter 13 Statement of Cash Flows.docx
+++ b/Kelompok 2 Pasca UTS/output/Kelompok 2_RMK Chapter 13 Statement of Cash Flows.docx
@@ -2833,7 +2833,16 @@
           <w:i w:val="0"/>
           <w:sz w:val="24"/>
         </w:rPr>
-        <w:t>mayoritas besar perusahaan Amerika menggunakan *metode tidak langsung</w:t>
+        <w:t>mayoritas besar perusahaan Amerika menggunakan</w:t>
+      </w:r>
+      <w:r>
+        <w:rPr>
+          <w:rFonts w:ascii="Times New Roman" w:hAnsi="Times New Roman" w:cs="Times New Roman"/>
+          <w:b w:val="0"/>
+          <w:i w:val="0"/>
+          <w:sz w:val="24"/>
+        </w:rPr>
+        <w:t xml:space="preserve"> </w:t>
       </w:r>
       <w:r>
         <w:rPr>
@@ -2842,13 +2851,22 @@
           <w:i/>
           <w:sz w:val="24"/>
         </w:rPr>
+        <w:t>metode tidak langsung</w:t>
+      </w:r>
+      <w:r>
+        <w:rPr>
+          <w:rFonts w:ascii="Times New Roman" w:hAnsi="Times New Roman" w:cs="Times New Roman"/>
+          <w:b w:val="0"/>
+          <w:i w:val="0"/>
+          <w:sz w:val="24"/>
+        </w:rPr>
         <w:t xml:space="preserve">, dan penyusun laporan tampaknya dipengaruhi oleh isu biaya — preferensi yang kuat terhadap metode tidak langsung yang lebih murah untuk disiapkan (Wolk et al., 2017, PDF hlm. 9). Persoalannya, dengan demikian, adalah persoalan biaya versus manfaat: </w:t>
       </w:r>
       <w:r>
         <w:rPr>
           <w:rFonts w:ascii="Times New Roman" w:hAnsi="Times New Roman" w:cs="Times New Roman"/>
           <w:b w:val="0"/>
-          <w:i w:val="0"/>
+          <w:i/>
           <w:sz w:val="24"/>
         </w:rPr>
         <w:t>metode langsung</w:t>
@@ -2857,46 +2875,136 @@
         <w:rPr>
           <w:rFonts w:ascii="Times New Roman" w:hAnsi="Times New Roman" w:cs="Times New Roman"/>
           <w:b w:val="0"/>
+          <w:i w:val="0"/>
+          <w:sz w:val="24"/>
+        </w:rPr>
+        <w:t xml:space="preserve"> menghasilkan bagian operasi yang mudah dipahami tetapi sulit disusun, sedangkan </w:t>
+      </w:r>
+      <w:r>
+        <w:rPr>
+          <w:rFonts w:ascii="Times New Roman" w:hAnsi="Times New Roman" w:cs="Times New Roman"/>
+          <w:b w:val="0"/>
           <w:i/>
           <w:sz w:val="24"/>
         </w:rPr>
-        <w:t xml:space="preserve"> menghasilkan bagian operasi yang mudah dipahami tetapi sulit disusun, sedangkan </w:t>
-      </w:r>
-      <w:r>
-        <w:rPr>
-          <w:rFonts w:ascii="Times New Roman" w:hAnsi="Times New Roman" w:cs="Times New Roman"/>
-          <w:b w:val="0"/>
-          <w:i w:val="0"/>
-          <w:sz w:val="24"/>
-        </w:rPr>
         <w:t>metode tidak langsung</w:t>
       </w:r>
       <w:r>
         <w:rPr>
           <w:rFonts w:ascii="Times New Roman" w:hAnsi="Times New Roman" w:cs="Times New Roman"/>
           <w:b w:val="0"/>
+          <w:i w:val="0"/>
+          <w:sz w:val="24"/>
+        </w:rPr>
+        <w:t xml:space="preserve"> sebaliknya — mudah disusun tetapi lebih sulit dipahami (Wolk et al., 2017, PDF hlm. 9). Bukti empiris yang terbatas justru mengindikasikan bahwa </w:t>
+      </w:r>
+      <w:r>
+        <w:rPr>
+          <w:rFonts w:ascii="Times New Roman" w:hAnsi="Times New Roman" w:cs="Times New Roman"/>
+          <w:b w:val="0"/>
           <w:i/>
           <w:sz w:val="24"/>
         </w:rPr>
-        <w:t xml:space="preserve"> sebaliknya — mudah disusun tetapi lebih sulit dipahami (Wolk et al., 2017, PDF hlm. 9). Bukti empiris yang terbatas justru mengindikasikan bahwa </w:t>
-      </w:r>
-      <w:r>
-        <w:rPr>
-          <w:rFonts w:ascii="Times New Roman" w:hAnsi="Times New Roman" w:cs="Times New Roman"/>
-          <w:b w:val="0"/>
-          <w:i w:val="0"/>
-          <w:sz w:val="24"/>
-        </w:rPr>
         <w:t>metode langsung</w:t>
       </w:r>
       <w:r>
         <w:rPr>
           <w:rFonts w:ascii="Times New Roman" w:hAnsi="Times New Roman" w:cs="Times New Roman"/>
           <w:b w:val="0"/>
+          <w:i w:val="0"/>
+          <w:sz w:val="24"/>
+        </w:rPr>
+        <w:t xml:space="preserve"> lebih disukai, khususnya oleh pengguna eksternal. Studi </w:t>
+      </w:r>
+      <w:r>
+        <w:rPr>
+          <w:rFonts w:ascii="Times New Roman" w:hAnsi="Times New Roman" w:cs="Times New Roman"/>
+          <w:b/>
+          <w:i w:val="0"/>
+          <w:sz w:val="24"/>
+        </w:rPr>
+        <w:t>McEnroe</w:t>
+      </w:r>
+      <w:r>
+        <w:rPr>
+          <w:rFonts w:ascii="Times New Roman" w:hAnsi="Times New Roman" w:cs="Times New Roman"/>
+          <w:b w:val="0"/>
+          <w:i w:val="0"/>
+          <w:sz w:val="24"/>
+        </w:rPr>
+        <w:t xml:space="preserve"> atas </w:t>
+      </w:r>
+      <w:r>
+        <w:rPr>
+          <w:rFonts w:ascii="Times New Roman" w:hAnsi="Times New Roman" w:cs="Times New Roman"/>
+          <w:b/>
+          <w:i w:val="0"/>
+          <w:sz w:val="24"/>
+        </w:rPr>
+        <w:t>282 responden</w:t>
+      </w:r>
+      <w:r>
+        <w:rPr>
+          <w:rFonts w:ascii="Times New Roman" w:hAnsi="Times New Roman" w:cs="Times New Roman"/>
+          <w:b w:val="0"/>
+          <w:i w:val="0"/>
+          <w:sz w:val="24"/>
+        </w:rPr>
+        <w:t xml:space="preserve"> — terdiri atas analis keuangan, penasihat investasi, profesor akuntansi, dan akuntan — menemukan bahwa </w:t>
+      </w:r>
+      <w:r>
+        <w:rPr>
+          <w:rFonts w:ascii="Times New Roman" w:hAnsi="Times New Roman" w:cs="Times New Roman"/>
+          <w:b/>
+          <w:i w:val="0"/>
+          <w:sz w:val="24"/>
+        </w:rPr>
+        <w:t>56%</w:t>
+      </w:r>
+      <w:r>
+        <w:rPr>
+          <w:rFonts w:ascii="Times New Roman" w:hAnsi="Times New Roman" w:cs="Times New Roman"/>
+          <w:b w:val="0"/>
+          <w:i w:val="0"/>
+          <w:sz w:val="24"/>
+        </w:rPr>
+        <w:t xml:space="preserve"> mendukung </w:t>
+      </w:r>
+      <w:r>
+        <w:rPr>
+          <w:rFonts w:ascii="Times New Roman" w:hAnsi="Times New Roman" w:cs="Times New Roman"/>
+          <w:b w:val="0"/>
           <w:i/>
           <w:sz w:val="24"/>
         </w:rPr>
-        <w:t xml:space="preserve"> lebih disukai, khususnya oleh pengguna eksternal. Studi </w:t>
+        <w:t>metode langsung</w:t>
+      </w:r>
+      <w:r>
+        <w:rPr>
+          <w:rFonts w:ascii="Times New Roman" w:hAnsi="Times New Roman" w:cs="Times New Roman"/>
+          <w:b w:val="0"/>
+          <w:i w:val="0"/>
+          <w:sz w:val="24"/>
+        </w:rPr>
+        <w:t xml:space="preserve"> berbanding </w:t>
+      </w:r>
+      <w:r>
+        <w:rPr>
+          <w:rFonts w:ascii="Times New Roman" w:hAnsi="Times New Roman" w:cs="Times New Roman"/>
+          <w:b/>
+          <w:i w:val="0"/>
+          <w:sz w:val="24"/>
+        </w:rPr>
+        <w:t>44%</w:t>
+      </w:r>
+      <w:r>
+        <w:rPr>
+          <w:rFonts w:ascii="Times New Roman" w:hAnsi="Times New Roman" w:cs="Times New Roman"/>
+          <w:b w:val="0"/>
+          <w:i w:val="0"/>
+          <w:sz w:val="24"/>
+        </w:rPr>
+        <w:t xml:space="preserve"> yang mendukung </w:t>
       </w:r>
       <w:r>
         <w:rPr>
@@ -2905,7 +3013,16 @@
           <w:i/>
           <w:sz w:val="24"/>
         </w:rPr>
-        <w:t>McEnroe</w:t>
+        <w:t>metode tidak langsung</w:t>
+      </w:r>
+      <w:r>
+        <w:rPr>
+          <w:rFonts w:ascii="Times New Roman" w:hAnsi="Times New Roman" w:cs="Times New Roman"/>
+          <w:b w:val="0"/>
+          <w:i w:val="0"/>
+          <w:sz w:val="24"/>
+        </w:rPr>
+        <w:t xml:space="preserve"> (Wolk et al., 2017, PDF hlm. 9). Ketegangan antara preferensi pengguna terhadap transparansi </w:t>
       </w:r>
       <w:r>
         <w:rPr>
@@ -2914,7 +3031,16 @@
           <w:i/>
           <w:sz w:val="24"/>
         </w:rPr>
-        <w:t xml:space="preserve"> atas </w:t>
+        <w:t>metode langsung</w:t>
+      </w:r>
+      <w:r>
+        <w:rPr>
+          <w:rFonts w:ascii="Times New Roman" w:hAnsi="Times New Roman" w:cs="Times New Roman"/>
+          <w:b w:val="0"/>
+          <w:i w:val="0"/>
+          <w:sz w:val="24"/>
+        </w:rPr>
+        <w:t xml:space="preserve"> dan preferensi penyusun terhadap rendahnya biaya </w:t>
       </w:r>
       <w:r>
         <w:rPr>
@@ -2923,88 +3049,16 @@
           <w:i/>
           <w:sz w:val="24"/>
         </w:rPr>
-        <w:t>282 responden</w:t>
-      </w:r>
-      <w:r>
-        <w:rPr>
-          <w:rFonts w:ascii="Times New Roman" w:hAnsi="Times New Roman" w:cs="Times New Roman"/>
-          <w:b w:val="0"/>
-          <w:i/>
-          <w:sz w:val="24"/>
-        </w:rPr>
-        <w:t xml:space="preserve"> — terdiri atas analis keuangan, penasihat investasi, profesor akuntansi, dan akuntan — menemukan bahwa </w:t>
-      </w:r>
-      <w:r>
-        <w:rPr>
-          <w:rFonts w:ascii="Times New Roman" w:hAnsi="Times New Roman" w:cs="Times New Roman"/>
-          <w:b w:val="0"/>
-          <w:i/>
-          <w:sz w:val="24"/>
-        </w:rPr>
-        <w:t xml:space="preserve">56% mendukung </w:t>
-      </w:r>
-      <w:r>
-        <w:rPr>
-          <w:rFonts w:ascii="Times New Roman" w:hAnsi="Times New Roman" w:cs="Times New Roman"/>
-          <w:b w:val="0"/>
-          <w:i w:val="0"/>
-          <w:sz w:val="24"/>
-        </w:rPr>
-        <w:t>metode langsung</w:t>
-      </w:r>
-      <w:r>
-        <w:rPr>
-          <w:rFonts w:ascii="Times New Roman" w:hAnsi="Times New Roman" w:cs="Times New Roman"/>
-          <w:b w:val="0"/>
-          <w:i/>
-          <w:sz w:val="24"/>
-        </w:rPr>
-        <w:t xml:space="preserve"> berbanding 44% yang mendukung </w:t>
-      </w:r>
-      <w:r>
-        <w:rPr>
-          <w:rFonts w:ascii="Times New Roman" w:hAnsi="Times New Roman" w:cs="Times New Roman"/>
-          <w:b w:val="0"/>
-          <w:i w:val="0"/>
-          <w:sz w:val="24"/>
-        </w:rPr>
-        <w:t>metode tidak langsung**</w:t>
-      </w:r>
-      <w:r>
-        <w:rPr>
-          <w:rFonts w:ascii="Times New Roman" w:hAnsi="Times New Roman" w:cs="Times New Roman"/>
-          <w:b w:val="0"/>
-          <w:i/>
-          <w:sz w:val="24"/>
-        </w:rPr>
-        <w:t xml:space="preserve"> (Wolk et al., 2017, PDF hlm. 9). Ketegangan antara preferensi pengguna terhadap transparansi </w:t>
-      </w:r>
-      <w:r>
-        <w:rPr>
-          <w:rFonts w:ascii="Times New Roman" w:hAnsi="Times New Roman" w:cs="Times New Roman"/>
-          <w:b w:val="0"/>
-          <w:i w:val="0"/>
-          <w:sz w:val="24"/>
-        </w:rPr>
-        <w:t>metode langsung</w:t>
-      </w:r>
-      <w:r>
-        <w:rPr>
-          <w:rFonts w:ascii="Times New Roman" w:hAnsi="Times New Roman" w:cs="Times New Roman"/>
-          <w:b w:val="0"/>
-          <w:i/>
-          <w:sz w:val="24"/>
-        </w:rPr>
-        <w:t xml:space="preserve"> dan preferensi penyusun terhadap rendahnya biaya </w:t>
-      </w:r>
-      <w:r>
-        <w:rPr>
-          <w:rFonts w:ascii="Times New Roman" w:hAnsi="Times New Roman" w:cs="Times New Roman"/>
-          <w:b w:val="0"/>
-          <w:i w:val="0"/>
-          <w:sz w:val="24"/>
-        </w:rPr>
-        <w:t>metode tidak langsung* inilah yang menjadi salah satu titik kritik terhadap SFAS No. 95.</w:t>
+        <w:t>metode tidak langsung</w:t>
+      </w:r>
+      <w:r>
+        <w:rPr>
+          <w:rFonts w:ascii="Times New Roman" w:hAnsi="Times New Roman" w:cs="Times New Roman"/>
+          <w:b w:val="0"/>
+          <w:i w:val="0"/>
+          <w:sz w:val="24"/>
+        </w:rPr>
+        <w:t xml:space="preserve"> inilah yang menjadi salah satu titik kritik terhadap SFAS No. 95.</w:t>
       </w:r>
     </w:p>
     <w:p>
@@ -3354,20 +3408,20 @@
       <w:r>
         <w:rPr>
           <w:rFonts w:ascii="Times New Roman" w:hAnsi="Times New Roman" w:cs="Times New Roman"/>
-          <w:b/>
-          <w:i w:val="0"/>
-          <w:sz w:val="24"/>
-        </w:rPr>
-        <w:t>*"business"</w:t>
-      </w:r>
-      <w:r>
-        <w:rPr>
-          <w:rFonts w:ascii="Times New Roman" w:hAnsi="Times New Roman" w:cs="Times New Roman"/>
-          <w:b w:val="0"/>
-          <w:i w:val="0"/>
-          <w:sz w:val="24"/>
-        </w:rPr>
-        <w:t>*, yang berpotensi mengurangi pergeseran klasifikasi yang dilakukan manajer antara aktivitas investasi dan operasi (Wolk et al., 2017, PDF hlm. 10–11).</w:t>
+          <w:b w:val="0"/>
+          <w:i/>
+          <w:sz w:val="24"/>
+        </w:rPr>
+        <w:t>"business"</w:t>
+      </w:r>
+      <w:r>
+        <w:rPr>
+          <w:rFonts w:ascii="Times New Roman" w:hAnsi="Times New Roman" w:cs="Times New Roman"/>
+          <w:b w:val="0"/>
+          <w:i w:val="0"/>
+          <w:sz w:val="24"/>
+        </w:rPr>
+        <w:t>, yang berpotensi mengurangi pergeseran klasifikasi yang dilakukan manajer antara aktivitas investasi dan operasi (Wolk et al., 2017, PDF hlm. 10–11).</w:t>
       </w:r>
     </w:p>
     <w:p>

</xml_diff>

<commit_message>
fix(k2-rmk): remove remaining nested bold/italic spans (4 leaks) and rebuild
Co-Authored-By: Claude Opus 4.8 (1M context) <noreply@anthropic.com>
</commit_message>
<xml_diff>
--- a/Kelompok 2 Pasca UTS/output/Kelompok 2_RMK Chapter 13 Statement of Cash Flows.docx
+++ b/Kelompok 2 Pasca UTS/output/Kelompok 2_RMK Chapter 13 Statement of Cash Flows.docx
@@ -3247,25 +3247,25 @@
           <w:i w:val="0"/>
           <w:sz w:val="24"/>
         </w:rPr>
-        <w:t xml:space="preserve"> mengilustrasikannya melalui kasus 3M Company untuk tahun fiskal 2005 dibandingkan 2004, yang membandingkan perubahan saldo akun neraca terhadap penyesuaian modal kerja dalam SCF untuk piutang usaha, persediaan, dan utang usaha. Yang paling mencolok, untuk piutang usaha, selisih persentase antara perubahan neraca dan penyesuaian SCF mencapai angka yang sangat besar — para penulis bahkan mengamati kasus-kasus di mana </w:t>
-      </w:r>
-      <w:r>
-        <w:rPr>
-          <w:rFonts w:ascii="Times New Roman" w:hAnsi="Times New Roman" w:cs="Times New Roman"/>
-          <w:b/>
-          <w:i w:val="0"/>
-          <w:sz w:val="24"/>
-        </w:rPr>
-        <w:t>tanda (*sign*) penyesuaian piutang usaha pun dapat berlawanan</w:t>
-      </w:r>
-      <w:r>
-        <w:rPr>
-          <w:rFonts w:ascii="Times New Roman" w:hAnsi="Times New Roman" w:cs="Times New Roman"/>
-          <w:b w:val="0"/>
-          <w:i w:val="0"/>
-          <w:sz w:val="24"/>
-        </w:rPr>
-        <w:t xml:space="preserve"> dengan tanda perubahan saldo neracanya, sehingga bukan hanya besarannya yang menyimpang melainkan arahnya (Wolk et al., 2017, PDF hlm. 10).</w:t>
+        <w:t xml:space="preserve"> mengilustrasikannya melalui kasus 3M Company untuk tahun fiskal 2005 dibandingkan 2004, yang membandingkan perubahan saldo akun neraca terhadap penyesuaian modal kerja dalam SCF untuk piutang usaha, persediaan, dan utang usaha. Yang paling mencolok, untuk piutang usaha, selisih persentase antara perubahan neraca dan penyesuaian SCF mencapai angka yang sangat besar — para penulis bahkan mengamati kasus-kasus di mana tanda (</w:t>
+      </w:r>
+      <w:r>
+        <w:rPr>
+          <w:rFonts w:ascii="Times New Roman" w:hAnsi="Times New Roman" w:cs="Times New Roman"/>
+          <w:b w:val="0"/>
+          <w:i/>
+          <w:sz w:val="24"/>
+        </w:rPr>
+        <w:t>sign</w:t>
+      </w:r>
+      <w:r>
+        <w:rPr>
+          <w:rFonts w:ascii="Times New Roman" w:hAnsi="Times New Roman" w:cs="Times New Roman"/>
+          <w:b w:val="0"/>
+          <w:i w:val="0"/>
+          <w:sz w:val="24"/>
+        </w:rPr>
+        <w:t>) penyesuaian piutang usaha pun dapat berlawanan dengan tanda perubahan saldo neracanya, sehingga bukan hanya besarannya yang menyimpang melainkan arahnya (Wolk et al., 2017, PDF hlm. 10).</w:t>
       </w:r>
     </w:p>
     <w:p>
@@ -3574,25 +3574,25 @@
           <w:i w:val="0"/>
           <w:sz w:val="24"/>
         </w:rPr>
-        <w:t xml:space="preserve">Akar persoalan ini terletak pada pilihan teoretis FASB. Dalam SFAS No. 95, FASB mengikuti </w:t>
-      </w:r>
-      <w:r>
-        <w:rPr>
-          <w:rFonts w:ascii="Times New Roman" w:hAnsi="Times New Roman" w:cs="Times New Roman"/>
-          <w:b/>
-          <w:i w:val="0"/>
-          <w:sz w:val="24"/>
-        </w:rPr>
-        <w:t>format laporan laba rugi dengan orientasi *proprietary* (kepemilikan)</w:t>
-      </w:r>
-      <w:r>
-        <w:rPr>
-          <w:rFonts w:ascii="Times New Roman" w:hAnsi="Times New Roman" w:cs="Times New Roman"/>
-          <w:b w:val="0"/>
-          <w:i w:val="0"/>
-          <w:sz w:val="24"/>
-        </w:rPr>
-        <w:t xml:space="preserve"> — pendapatan dan beban bunga serta pendapatan dividen diperlakukan sebagai pos operasi. Pendekatan ini bertolak belakang dengan pendekatan </w:t>
+        <w:t xml:space="preserve">Akar persoalan ini terletak pada pilihan teoretis FASB. Dalam SFAS No. 95, FASB mengikuti format laporan laba rugi dengan orientasi </w:t>
+      </w:r>
+      <w:r>
+        <w:rPr>
+          <w:rFonts w:ascii="Times New Roman" w:hAnsi="Times New Roman" w:cs="Times New Roman"/>
+          <w:b w:val="0"/>
+          <w:i/>
+          <w:sz w:val="24"/>
+        </w:rPr>
+        <w:t>proprietary</w:t>
+      </w:r>
+      <w:r>
+        <w:rPr>
+          <w:rFonts w:ascii="Times New Roman" w:hAnsi="Times New Roman" w:cs="Times New Roman"/>
+          <w:b w:val="0"/>
+          <w:i w:val="0"/>
+          <w:sz w:val="24"/>
+        </w:rPr>
+        <w:t xml:space="preserve"> (kepemilikan) — pendapatan dan beban bunga serta pendapatan dividen diperlakukan sebagai pos operasi. Pendekatan ini bertolak belakang dengan pendekatan </w:t>
       </w:r>
       <w:r>
         <w:rPr>
@@ -6338,25 +6338,25 @@
           <w:i w:val="0"/>
           <w:sz w:val="24"/>
         </w:rPr>
-        <w:t xml:space="preserve"> sama-sama berpotensi memuat informasi yang berharga, FASB sebaiknya </w:t>
-      </w:r>
-      <w:r>
-        <w:rPr>
-          <w:rFonts w:ascii="Times New Roman" w:hAnsi="Times New Roman" w:cs="Times New Roman"/>
-          <w:b/>
-          <w:i w:val="0"/>
-          <w:sz w:val="24"/>
-        </w:rPr>
-        <w:t>mewajibkan *metode langsung* sekaligus rekonsiliasi laba bersih ke arus kas operasi</w:t>
-      </w:r>
-      <w:r>
-        <w:rPr>
-          <w:rFonts w:ascii="Times New Roman" w:hAnsi="Times New Roman" w:cs="Times New Roman"/>
-          <w:b w:val="0"/>
-          <w:i w:val="0"/>
-          <w:sz w:val="24"/>
-        </w:rPr>
-        <w:t xml:space="preserve"> yang menyertainya untuk bagian operasi.</w:t>
+        <w:t xml:space="preserve"> sama-sama berpotensi memuat informasi yang berharga, FASB sebaiknya mewajibkan </w:t>
+      </w:r>
+      <w:r>
+        <w:rPr>
+          <w:rFonts w:ascii="Times New Roman" w:hAnsi="Times New Roman" w:cs="Times New Roman"/>
+          <w:b w:val="0"/>
+          <w:i/>
+          <w:sz w:val="24"/>
+        </w:rPr>
+        <w:t>metode langsung</w:t>
+      </w:r>
+      <w:r>
+        <w:rPr>
+          <w:rFonts w:ascii="Times New Roman" w:hAnsi="Times New Roman" w:cs="Times New Roman"/>
+          <w:b w:val="0"/>
+          <w:i w:val="0"/>
+          <w:sz w:val="24"/>
+        </w:rPr>
+        <w:t xml:space="preserve"> sekaligus rekonsiliasi laba bersih ke arus kas operasi yang menyertainya untuk bagian operasi.</w:t>
       </w:r>
     </w:p>
     <w:p>
@@ -6457,25 +6457,25 @@
           <w:i w:val="0"/>
           <w:sz w:val="24"/>
         </w:rPr>
-        <w:t xml:space="preserve">Para penulis menambahkan rekomendasi mereka sendiri. Mereka </w:t>
-      </w:r>
-      <w:r>
-        <w:rPr>
-          <w:rFonts w:ascii="Times New Roman" w:hAnsi="Times New Roman" w:cs="Times New Roman"/>
-          <w:b/>
-          <w:i w:val="0"/>
-          <w:sz w:val="24"/>
-        </w:rPr>
-        <w:t>sependapat dengan Broome bahwa *metode langsung* semestinya diwajibkan</w:t>
-      </w:r>
-      <w:r>
-        <w:rPr>
-          <w:rFonts w:ascii="Times New Roman" w:hAnsi="Times New Roman" w:cs="Times New Roman"/>
-          <w:b w:val="0"/>
-          <w:i w:val="0"/>
-          <w:sz w:val="24"/>
-        </w:rPr>
-        <w:t xml:space="preserve">. Namun, apabila sistem pilihan yang ada tetap dipertahankan, perusahaan sebaiknya diwajibkan menyajikan </w:t>
+        <w:t xml:space="preserve">Para penulis menambahkan rekomendasi mereka sendiri. Mereka sependapat dengan Broome bahwa </w:t>
+      </w:r>
+      <w:r>
+        <w:rPr>
+          <w:rFonts w:ascii="Times New Roman" w:hAnsi="Times New Roman" w:cs="Times New Roman"/>
+          <w:b w:val="0"/>
+          <w:i/>
+          <w:sz w:val="24"/>
+        </w:rPr>
+        <w:t>metode langsung</w:t>
+      </w:r>
+      <w:r>
+        <w:rPr>
+          <w:rFonts w:ascii="Times New Roman" w:hAnsi="Times New Roman" w:cs="Times New Roman"/>
+          <w:b w:val="0"/>
+          <w:i w:val="0"/>
+          <w:sz w:val="24"/>
+        </w:rPr>
+        <w:t xml:space="preserve"> semestinya diwajibkan. Namun, apabila sistem pilihan yang ada tetap dipertahankan, perusahaan sebaiknya diwajibkan menyajikan </w:t>
       </w:r>
       <w:r>
         <w:rPr>

</xml_diff>

<commit_message>
feat(k2-rmk): place 11 visuals in RMK per placement map
Co-Authored-By: Claude Opus 4.8 (1M context) <noreply@anthropic.com>
</commit_message>
<xml_diff>
--- a/Kelompok 2 Pasca UTS/output/Kelompok 2_RMK Chapter 13 Statement of Cash Flows.docx
+++ b/Kelompok 2 Pasca UTS/output/Kelompok 2_RMK Chapter 13 Statement of Cash Flows.docx
@@ -1443,6 +1443,85 @@
     </w:p>
     <w:p>
       <w:pPr>
+        <w:spacing w:before="120" w:after="120"/>
+        <w:jc w:val="center"/>
+      </w:pPr>
+      <w:r>
+        <w:drawing>
+          <wp:inline xmlns:a="http://schemas.openxmlformats.org/drawingml/2006/main" xmlns:pic="http://schemas.openxmlformats.org/drawingml/2006/picture">
+            <wp:extent cx="5220000" cy="1503141"/>
+            <wp:docPr id="1" name="Picture 1"/>
+            <wp:cNvGraphicFramePr>
+              <a:graphicFrameLocks noChangeAspect="1"/>
+            </wp:cNvGraphicFramePr>
+            <a:graphic>
+              <a:graphicData uri="http://schemas.openxmlformats.org/drawingml/2006/picture">
+                <pic:pic>
+                  <pic:nvPicPr>
+                    <pic:cNvPr id="0" name="diagram-timeline.png"/>
+                    <pic:cNvPicPr/>
+                  </pic:nvPicPr>
+                  <pic:blipFill>
+                    <a:blip r:embed="rId9"/>
+                    <a:stretch>
+                      <a:fillRect/>
+                    </a:stretch>
+                  </pic:blipFill>
+                  <pic:spPr>
+                    <a:xfrm>
+                      <a:off x="0" y="0"/>
+                      <a:ext cx="5220000" cy="1503141"/>
+                    </a:xfrm>
+                    <a:prstGeom prst="rect"/>
+                  </pic:spPr>
+                </pic:pic>
+              </a:graphicData>
+            </a:graphic>
+          </wp:inline>
+        </w:drawing>
+      </w:r>
+    </w:p>
+    <w:p>
+      <w:pPr>
+        <w:spacing w:lineRule="exact" w:line="360" w:before="0" w:after="0"/>
+        <w:jc w:val="center"/>
+      </w:pPr>
+      <w:r>
+        <w:rPr>
+          <w:rFonts w:ascii="Times New Roman" w:hAnsi="Times New Roman" w:cs="Times New Roman"/>
+          <w:b/>
+          <w:i w:val="0"/>
+          <w:sz w:val="22"/>
+        </w:rPr>
+        <w:t xml:space="preserve">Gambar 1. </w:t>
+      </w:r>
+      <w:r>
+        <w:rPr>
+          <w:rFonts w:ascii="Times New Roman" w:hAnsi="Times New Roman" w:cs="Times New Roman"/>
+          <w:b w:val="0"/>
+          <w:i w:val="0"/>
+          <w:sz w:val="22"/>
+        </w:rPr>
+        <w:t>Lini masa evolusi pelaporan aliran dana, 1963–2008</w:t>
+      </w:r>
+    </w:p>
+    <w:p>
+      <w:pPr>
+        <w:spacing w:lineRule="exact" w:line="360" w:before="0" w:after="240"/>
+        <w:jc w:val="center"/>
+      </w:pPr>
+      <w:r>
+        <w:rPr>
+          <w:rFonts w:ascii="Times New Roman" w:hAnsi="Times New Roman" w:cs="Times New Roman"/>
+          <w:b w:val="0"/>
+          <w:i/>
+          <w:sz w:val="22"/>
+        </w:rPr>
+        <w:t>Sumber: diolah dari Wolk, Dodd &amp; Rozycki (2017), PDF hlm. 4, 10–11</w:t>
+      </w:r>
+    </w:p>
+    <w:p>
+      <w:pPr>
         <w:spacing w:lineRule="exact" w:line="360" w:before="240" w:after="120"/>
         <w:jc w:val="left"/>
       </w:pPr>
@@ -2241,6 +2320,85 @@
     </w:p>
     <w:p>
       <w:pPr>
+        <w:spacing w:before="120" w:after="120"/>
+        <w:jc w:val="center"/>
+      </w:pPr>
+      <w:r>
+        <w:drawing>
+          <wp:inline xmlns:a="http://schemas.openxmlformats.org/drawingml/2006/main" xmlns:pic="http://schemas.openxmlformats.org/drawingml/2006/picture">
+            <wp:extent cx="5220000" cy="2163680"/>
+            <wp:docPr id="2" name="Picture 2"/>
+            <wp:cNvGraphicFramePr>
+              <a:graphicFrameLocks noChangeAspect="1"/>
+            </wp:cNvGraphicFramePr>
+            <a:graphic>
+              <a:graphicData uri="http://schemas.openxmlformats.org/drawingml/2006/picture">
+                <pic:pic>
+                  <pic:nvPicPr>
+                    <pic:cNvPr id="0" name="diagram-trichotomy.png"/>
+                    <pic:cNvPicPr/>
+                  </pic:nvPicPr>
+                  <pic:blipFill>
+                    <a:blip r:embed="rId10"/>
+                    <a:stretch>
+                      <a:fillRect/>
+                    </a:stretch>
+                  </pic:blipFill>
+                  <pic:spPr>
+                    <a:xfrm>
+                      <a:off x="0" y="0"/>
+                      <a:ext cx="5220000" cy="2163680"/>
+                    </a:xfrm>
+                    <a:prstGeom prst="rect"/>
+                  </pic:spPr>
+                </pic:pic>
+              </a:graphicData>
+            </a:graphic>
+          </wp:inline>
+        </w:drawing>
+      </w:r>
+    </w:p>
+    <w:p>
+      <w:pPr>
+        <w:spacing w:lineRule="exact" w:line="360" w:before="0" w:after="0"/>
+        <w:jc w:val="center"/>
+      </w:pPr>
+      <w:r>
+        <w:rPr>
+          <w:rFonts w:ascii="Times New Roman" w:hAnsi="Times New Roman" w:cs="Times New Roman"/>
+          <w:b/>
+          <w:i w:val="0"/>
+          <w:sz w:val="22"/>
+        </w:rPr>
+        <w:t xml:space="preserve">Gambar 2. </w:t>
+      </w:r>
+      <w:r>
+        <w:rPr>
+          <w:rFonts w:ascii="Times New Roman" w:hAnsi="Times New Roman" w:cs="Times New Roman"/>
+          <w:b w:val="0"/>
+          <w:i w:val="0"/>
+          <w:sz w:val="22"/>
+        </w:rPr>
+        <w:t>Trikotomi aktivitas SFAS No. 95 dan pos-pos yang diperdebatkan</w:t>
+      </w:r>
+    </w:p>
+    <w:p>
+      <w:pPr>
+        <w:spacing w:lineRule="exact" w:line="360" w:before="0" w:after="240"/>
+        <w:jc w:val="center"/>
+      </w:pPr>
+      <w:r>
+        <w:rPr>
+          <w:rFonts w:ascii="Times New Roman" w:hAnsi="Times New Roman" w:cs="Times New Roman"/>
+          <w:b w:val="0"/>
+          <w:i/>
+          <w:sz w:val="22"/>
+        </w:rPr>
+        <w:t>Sumber: diolah dari Wolk, Dodd &amp; Rozycki (2017), PDF hlm. 7</w:t>
+      </w:r>
+    </w:p>
+    <w:p>
+      <w:pPr>
         <w:spacing w:lineRule="exact" w:line="360" w:before="240" w:after="120"/>
         <w:jc w:val="left"/>
       </w:pPr>
@@ -2709,107 +2867,160 @@
     </w:p>
     <w:p>
       <w:pPr>
-        <w:spacing w:lineRule="exact" w:line="360" w:before="0" w:after="120"/>
-        <w:jc w:val="both"/>
+        <w:spacing w:before="120" w:after="120"/>
+        <w:jc w:val="center"/>
       </w:pPr>
       <w:r>
-        <w:rPr>
-          <w:rFonts w:ascii="Times New Roman" w:hAnsi="Times New Roman" w:cs="Times New Roman"/>
-          <w:b w:val="0"/>
-          <w:i w:val="0"/>
-          <w:sz w:val="24"/>
-        </w:rPr>
-        <w:t xml:space="preserve">Apabila </w:t>
-      </w:r>
+        <w:drawing>
+          <wp:inline xmlns:a="http://schemas.openxmlformats.org/drawingml/2006/main" xmlns:pic="http://schemas.openxmlformats.org/drawingml/2006/picture">
+            <wp:extent cx="5220000" cy="6260507"/>
+            <wp:docPr id="3" name="Picture 3"/>
+            <wp:cNvGraphicFramePr>
+              <a:graphicFrameLocks noChangeAspect="1"/>
+            </wp:cNvGraphicFramePr>
+            <a:graphic>
+              <a:graphicData uri="http://schemas.openxmlformats.org/drawingml/2006/picture">
+                <pic:pic>
+                  <pic:nvPicPr>
+                    <pic:cNvPr id="0" name="exhibit-13-2.png"/>
+                    <pic:cNvPicPr/>
+                  </pic:nvPicPr>
+                  <pic:blipFill>
+                    <a:blip r:embed="rId11"/>
+                    <a:stretch>
+                      <a:fillRect/>
+                    </a:stretch>
+                  </pic:blipFill>
+                  <pic:spPr>
+                    <a:xfrm>
+                      <a:off x="0" y="0"/>
+                      <a:ext cx="5220000" cy="6260507"/>
+                    </a:xfrm>
+                    <a:prstGeom prst="rect"/>
+                  </pic:spPr>
+                </pic:pic>
+              </a:graphicData>
+            </a:graphic>
+          </wp:inline>
+        </w:drawing>
+      </w:r>
+    </w:p>
+    <w:p>
+      <w:pPr>
+        <w:spacing w:lineRule="exact" w:line="360" w:before="0" w:after="0"/>
+        <w:jc w:val="center"/>
+      </w:pPr>
+      <w:r>
+        <w:rPr>
+          <w:rFonts w:ascii="Times New Roman" w:hAnsi="Times New Roman" w:cs="Times New Roman"/>
+          <w:b/>
+          <w:i w:val="0"/>
+          <w:sz w:val="22"/>
+        </w:rPr>
+        <w:t xml:space="preserve">Gambar 3. </w:t>
+      </w:r>
+      <w:r>
+        <w:rPr>
+          <w:rFonts w:ascii="Times New Roman" w:hAnsi="Times New Roman" w:cs="Times New Roman"/>
+          <w:b w:val="0"/>
+          <w:i w:val="0"/>
+          <w:sz w:val="22"/>
+        </w:rPr>
+        <w:t>SCF metode langsung — Company M (Exhibit 13.2)</w:t>
+      </w:r>
+    </w:p>
+    <w:p>
+      <w:pPr>
+        <w:spacing w:lineRule="exact" w:line="360" w:before="0" w:after="240"/>
+        <w:jc w:val="center"/>
+      </w:pPr>
       <w:r>
         <w:rPr>
           <w:rFonts w:ascii="Times New Roman" w:hAnsi="Times New Roman" w:cs="Times New Roman"/>
           <w:b w:val="0"/>
           <w:i/>
-          <w:sz w:val="24"/>
-        </w:rPr>
-        <w:t>metode langsung</w:t>
-      </w:r>
-      <w:r>
-        <w:rPr>
-          <w:rFonts w:ascii="Times New Roman" w:hAnsi="Times New Roman" w:cs="Times New Roman"/>
-          <w:b w:val="0"/>
-          <w:i w:val="0"/>
-          <w:sz w:val="24"/>
-        </w:rPr>
-        <w:t xml:space="preserve"> digunakan, sebuah skedul terpisah harus merekonsiliasi kas bersih operasi dengan laba bersih (Exhibit 13.3) — sehingga rekonsiliasi </w:t>
-      </w:r>
+          <w:sz w:val="22"/>
+        </w:rPr>
+        <w:t>Sumber: Wolk, Dodd &amp; Rozycki (2017), Exhibit 13.2, PDF hlm. 7–8</w:t>
+      </w:r>
+    </w:p>
+    <w:p>
+      <w:pPr>
+        <w:spacing w:before="120" w:after="120"/>
+        <w:jc w:val="center"/>
+      </w:pPr>
+      <w:r>
+        <w:drawing>
+          <wp:inline xmlns:a="http://schemas.openxmlformats.org/drawingml/2006/main" xmlns:pic="http://schemas.openxmlformats.org/drawingml/2006/picture">
+            <wp:extent cx="5220000" cy="5491979"/>
+            <wp:docPr id="4" name="Picture 4"/>
+            <wp:cNvGraphicFramePr>
+              <a:graphicFrameLocks noChangeAspect="1"/>
+            </wp:cNvGraphicFramePr>
+            <a:graphic>
+              <a:graphicData uri="http://schemas.openxmlformats.org/drawingml/2006/picture">
+                <pic:pic>
+                  <pic:nvPicPr>
+                    <pic:cNvPr id="0" name="exhibit-13-3.png"/>
+                    <pic:cNvPicPr/>
+                  </pic:nvPicPr>
+                  <pic:blipFill>
+                    <a:blip r:embed="rId12"/>
+                    <a:stretch>
+                      <a:fillRect/>
+                    </a:stretch>
+                  </pic:blipFill>
+                  <pic:spPr>
+                    <a:xfrm>
+                      <a:off x="0" y="0"/>
+                      <a:ext cx="5220000" cy="5491979"/>
+                    </a:xfrm>
+                    <a:prstGeom prst="rect"/>
+                  </pic:spPr>
+                </pic:pic>
+              </a:graphicData>
+            </a:graphic>
+          </wp:inline>
+        </w:drawing>
+      </w:r>
+    </w:p>
+    <w:p>
+      <w:pPr>
+        <w:spacing w:lineRule="exact" w:line="360" w:before="0" w:after="0"/>
+        <w:jc w:val="center"/>
+      </w:pPr>
+      <w:r>
+        <w:rPr>
+          <w:rFonts w:ascii="Times New Roman" w:hAnsi="Times New Roman" w:cs="Times New Roman"/>
+          <w:b/>
+          <w:i w:val="0"/>
+          <w:sz w:val="22"/>
+        </w:rPr>
+        <w:t xml:space="preserve">Gambar 4. </w:t>
+      </w:r>
+      <w:r>
+        <w:rPr>
+          <w:rFonts w:ascii="Times New Roman" w:hAnsi="Times New Roman" w:cs="Times New Roman"/>
+          <w:b w:val="0"/>
+          <w:i w:val="0"/>
+          <w:sz w:val="22"/>
+        </w:rPr>
+        <w:t>Rekonsiliasi metode tidak langsung — Company M (Exhibit 13.3)</w:t>
+      </w:r>
+    </w:p>
+    <w:p>
+      <w:pPr>
+        <w:spacing w:lineRule="exact" w:line="360" w:before="0" w:after="240"/>
+        <w:jc w:val="center"/>
+      </w:pPr>
       <w:r>
         <w:rPr>
           <w:rFonts w:ascii="Times New Roman" w:hAnsi="Times New Roman" w:cs="Times New Roman"/>
           <w:b w:val="0"/>
           <w:i/>
-          <w:sz w:val="24"/>
-        </w:rPr>
-        <w:t>metode tidak langsung</w:t>
-      </w:r>
-      <w:r>
-        <w:rPr>
-          <w:rFonts w:ascii="Times New Roman" w:hAnsi="Times New Roman" w:cs="Times New Roman"/>
-          <w:b w:val="0"/>
-          <w:i w:val="0"/>
-          <w:sz w:val="24"/>
-        </w:rPr>
-        <w:t xml:space="preserve"> pada hakikatnya selalu hadir, entah berdiri sendiri atau sebagai pelengkap </w:t>
-      </w:r>
-      <w:r>
-        <w:rPr>
-          <w:rFonts w:ascii="Times New Roman" w:hAnsi="Times New Roman" w:cs="Times New Roman"/>
-          <w:b w:val="0"/>
-          <w:i/>
-          <w:sz w:val="24"/>
-        </w:rPr>
-        <w:t>metode langsung</w:t>
-      </w:r>
-      <w:r>
-        <w:rPr>
-          <w:rFonts w:ascii="Times New Roman" w:hAnsi="Times New Roman" w:cs="Times New Roman"/>
-          <w:b w:val="0"/>
-          <w:i w:val="0"/>
-          <w:sz w:val="24"/>
-        </w:rPr>
-        <w:t xml:space="preserve">. Exhibit 13.3 sekaligus menampilkan skedul pelengkap atas aktivitas investasi dan pendanaan nonkas yang disyaratkan, baik metode langsung maupun tidak langsung yang dipakai sebagai metode utama (Wolk et al., 2017, PDF hlm. 7). Beberapa anggota FASB meyakini bahwa mengizinkan </w:t>
-      </w:r>
-      <w:r>
-        <w:rPr>
-          <w:rFonts w:ascii="Times New Roman" w:hAnsi="Times New Roman" w:cs="Times New Roman"/>
-          <w:b w:val="0"/>
-          <w:i/>
-          <w:sz w:val="24"/>
-        </w:rPr>
-        <w:t>metode tidak langsung</w:t>
-      </w:r>
-      <w:r>
-        <w:rPr>
-          <w:rFonts w:ascii="Times New Roman" w:hAnsi="Times New Roman" w:cs="Times New Roman"/>
-          <w:b w:val="0"/>
-          <w:i w:val="0"/>
-          <w:sz w:val="24"/>
-        </w:rPr>
-        <w:t xml:space="preserve"> </w:t>
-      </w:r>
-      <w:r>
-        <w:rPr>
-          <w:rFonts w:ascii="Times New Roman" w:hAnsi="Times New Roman" w:cs="Times New Roman"/>
-          <w:b/>
-          <w:i w:val="0"/>
-          <w:sz w:val="24"/>
-        </w:rPr>
-        <w:t>menghambat pemahaman pengguna dan menurunkan kualitas pelaporan keuangan</w:t>
-      </w:r>
-      <w:r>
-        <w:rPr>
-          <w:rFonts w:ascii="Times New Roman" w:hAnsi="Times New Roman" w:cs="Times New Roman"/>
-          <w:b w:val="0"/>
-          <w:i w:val="0"/>
-          <w:sz w:val="24"/>
-        </w:rPr>
-        <w:t xml:space="preserve"> (Wolk et al., 2017, PDF hlm. 7).</w:t>
+          <w:sz w:val="22"/>
+        </w:rPr>
+        <w:t>Sumber: Wolk, Dodd &amp; Rozycki (2017), Exhibit 13.3, PDF hlm. 8</w:t>
       </w:r>
     </w:p>
     <w:p>
@@ -2824,6 +3035,111 @@
           <w:i w:val="0"/>
           <w:sz w:val="24"/>
         </w:rPr>
+        <w:t xml:space="preserve">Apabila </w:t>
+      </w:r>
+      <w:r>
+        <w:rPr>
+          <w:rFonts w:ascii="Times New Roman" w:hAnsi="Times New Roman" w:cs="Times New Roman"/>
+          <w:b w:val="0"/>
+          <w:i/>
+          <w:sz w:val="24"/>
+        </w:rPr>
+        <w:t>metode langsung</w:t>
+      </w:r>
+      <w:r>
+        <w:rPr>
+          <w:rFonts w:ascii="Times New Roman" w:hAnsi="Times New Roman" w:cs="Times New Roman"/>
+          <w:b w:val="0"/>
+          <w:i w:val="0"/>
+          <w:sz w:val="24"/>
+        </w:rPr>
+        <w:t xml:space="preserve"> digunakan, sebuah skedul terpisah harus merekonsiliasi kas bersih operasi dengan laba bersih (Exhibit 13.3) — sehingga rekonsiliasi </w:t>
+      </w:r>
+      <w:r>
+        <w:rPr>
+          <w:rFonts w:ascii="Times New Roman" w:hAnsi="Times New Roman" w:cs="Times New Roman"/>
+          <w:b w:val="0"/>
+          <w:i/>
+          <w:sz w:val="24"/>
+        </w:rPr>
+        <w:t>metode tidak langsung</w:t>
+      </w:r>
+      <w:r>
+        <w:rPr>
+          <w:rFonts w:ascii="Times New Roman" w:hAnsi="Times New Roman" w:cs="Times New Roman"/>
+          <w:b w:val="0"/>
+          <w:i w:val="0"/>
+          <w:sz w:val="24"/>
+        </w:rPr>
+        <w:t xml:space="preserve"> pada hakikatnya selalu hadir, entah berdiri sendiri atau sebagai pelengkap </w:t>
+      </w:r>
+      <w:r>
+        <w:rPr>
+          <w:rFonts w:ascii="Times New Roman" w:hAnsi="Times New Roman" w:cs="Times New Roman"/>
+          <w:b w:val="0"/>
+          <w:i/>
+          <w:sz w:val="24"/>
+        </w:rPr>
+        <w:t>metode langsung</w:t>
+      </w:r>
+      <w:r>
+        <w:rPr>
+          <w:rFonts w:ascii="Times New Roman" w:hAnsi="Times New Roman" w:cs="Times New Roman"/>
+          <w:b w:val="0"/>
+          <w:i w:val="0"/>
+          <w:sz w:val="24"/>
+        </w:rPr>
+        <w:t xml:space="preserve">. Exhibit 13.3 sekaligus menampilkan skedul pelengkap atas aktivitas investasi dan pendanaan nonkas yang disyaratkan, baik metode langsung maupun tidak langsung yang dipakai sebagai metode utama (Wolk et al., 2017, PDF hlm. 7). Beberapa anggota FASB meyakini bahwa mengizinkan </w:t>
+      </w:r>
+      <w:r>
+        <w:rPr>
+          <w:rFonts w:ascii="Times New Roman" w:hAnsi="Times New Roman" w:cs="Times New Roman"/>
+          <w:b w:val="0"/>
+          <w:i/>
+          <w:sz w:val="24"/>
+        </w:rPr>
+        <w:t>metode tidak langsung</w:t>
+      </w:r>
+      <w:r>
+        <w:rPr>
+          <w:rFonts w:ascii="Times New Roman" w:hAnsi="Times New Roman" w:cs="Times New Roman"/>
+          <w:b w:val="0"/>
+          <w:i w:val="0"/>
+          <w:sz w:val="24"/>
+        </w:rPr>
+        <w:t xml:space="preserve"> </w:t>
+      </w:r>
+      <w:r>
+        <w:rPr>
+          <w:rFonts w:ascii="Times New Roman" w:hAnsi="Times New Roman" w:cs="Times New Roman"/>
+          <w:b/>
+          <w:i w:val="0"/>
+          <w:sz w:val="24"/>
+        </w:rPr>
+        <w:t>menghambat pemahaman pengguna dan menurunkan kualitas pelaporan keuangan</w:t>
+      </w:r>
+      <w:r>
+        <w:rPr>
+          <w:rFonts w:ascii="Times New Roman" w:hAnsi="Times New Roman" w:cs="Times New Roman"/>
+          <w:b w:val="0"/>
+          <w:i w:val="0"/>
+          <w:sz w:val="24"/>
+        </w:rPr>
+        <w:t xml:space="preserve"> (Wolk et al., 2017, PDF hlm. 7).</w:t>
+      </w:r>
+    </w:p>
+    <w:p>
+      <w:pPr>
+        <w:spacing w:lineRule="exact" w:line="360" w:before="0" w:after="120"/>
+        <w:jc w:val="both"/>
+      </w:pPr>
+      <w:r>
+        <w:rPr>
+          <w:rFonts w:ascii="Times New Roman" w:hAnsi="Times New Roman" w:cs="Times New Roman"/>
+          <w:b w:val="0"/>
+          <w:i w:val="0"/>
+          <w:sz w:val="24"/>
+        </w:rPr>
         <w:t xml:space="preserve">Meskipun demikian, kenyataannya </w:t>
       </w:r>
       <w:r>
@@ -3270,89 +3586,81 @@
     </w:p>
     <w:p>
       <w:pPr>
-        <w:spacing w:lineRule="exact" w:line="360" w:before="0" w:after="120"/>
-        <w:jc w:val="both"/>
+        <w:spacing w:before="120" w:after="120"/>
+        <w:jc w:val="center"/>
       </w:pPr>
       <w:r>
-        <w:rPr>
-          <w:rFonts w:ascii="Times New Roman" w:hAnsi="Times New Roman" w:cs="Times New Roman"/>
-          <w:b w:val="0"/>
-          <w:i w:val="0"/>
-          <w:sz w:val="24"/>
-        </w:rPr>
-        <w:t xml:space="preserve">Bab ini mengidentifikasi tiga penyebab nonartikulasi. </w:t>
-      </w:r>
+        <w:drawing>
+          <wp:inline xmlns:a="http://schemas.openxmlformats.org/drawingml/2006/main" xmlns:pic="http://schemas.openxmlformats.org/drawingml/2006/picture">
+            <wp:extent cx="5220000" cy="1404809"/>
+            <wp:docPr id="5" name="Picture 5"/>
+            <wp:cNvGraphicFramePr>
+              <a:graphicFrameLocks noChangeAspect="1"/>
+            </wp:cNvGraphicFramePr>
+            <a:graphic>
+              <a:graphicData uri="http://schemas.openxmlformats.org/drawingml/2006/picture">
+                <pic:pic>
+                  <pic:nvPicPr>
+                    <pic:cNvPr id="0" name="exhibit-13-4.png"/>
+                    <pic:cNvPicPr/>
+                  </pic:nvPicPr>
+                  <pic:blipFill>
+                    <a:blip r:embed="rId13"/>
+                    <a:stretch>
+                      <a:fillRect/>
+                    </a:stretch>
+                  </pic:blipFill>
+                  <pic:spPr>
+                    <a:xfrm>
+                      <a:off x="0" y="0"/>
+                      <a:ext cx="5220000" cy="1404809"/>
+                    </a:xfrm>
+                    <a:prstGeom prst="rect"/>
+                  </pic:spPr>
+                </pic:pic>
+              </a:graphicData>
+            </a:graphic>
+          </wp:inline>
+        </w:drawing>
+      </w:r>
+    </w:p>
+    <w:p>
+      <w:pPr>
+        <w:spacing w:lineRule="exact" w:line="360" w:before="0" w:after="0"/>
+        <w:jc w:val="center"/>
+      </w:pPr>
+      <w:r>
+        <w:rPr>
+          <w:rFonts w:ascii="Times New Roman" w:hAnsi="Times New Roman" w:cs="Times New Roman"/>
+          <w:b/>
+          <w:i w:val="0"/>
+          <w:sz w:val="22"/>
+        </w:rPr>
+        <w:t xml:space="preserve">Gambar 5. </w:t>
+      </w:r>
+      <w:r>
+        <w:rPr>
+          <w:rFonts w:ascii="Times New Roman" w:hAnsi="Times New Roman" w:cs="Times New Roman"/>
+          <w:b w:val="0"/>
+          <w:i w:val="0"/>
+          <w:sz w:val="22"/>
+        </w:rPr>
+        <w:t>Nonartikulasi pada 3M Company (Exhibit 13.4)</w:t>
+      </w:r>
+    </w:p>
+    <w:p>
+      <w:pPr>
+        <w:spacing w:lineRule="exact" w:line="360" w:before="0" w:after="240"/>
+        <w:jc w:val="center"/>
+      </w:pPr>
       <w:r>
         <w:rPr>
           <w:rFonts w:ascii="Times New Roman" w:hAnsi="Times New Roman" w:cs="Times New Roman"/>
           <w:b w:val="0"/>
           <w:i/>
-          <w:sz w:val="24"/>
-        </w:rPr>
-        <w:t>Penyebab pertama</w:t>
-      </w:r>
-      <w:r>
-        <w:rPr>
-          <w:rFonts w:ascii="Times New Roman" w:hAnsi="Times New Roman" w:cs="Times New Roman"/>
-          <w:b w:val="0"/>
-          <w:i w:val="0"/>
-          <w:sz w:val="24"/>
-        </w:rPr>
-        <w:t xml:space="preserve"> adalah akuisisi anak perusahaan selama tahun berjalan: ketika sebuah perusahaan mengakuisisi anak perusahaan, saldo modal kerja awal tahun dari perusahaan yang diakuisisi tidak tercakup dalam neraca konsolidasi awal; agar berartikulasi, saldo-saldo yang hilang itu harus dimasukkan ke dalam saldo awal tahun perusahaan terkonsolidasi (Wolk et al., 2017, PDF hlm. 10). </w:t>
-      </w:r>
-      <w:r>
-        <w:rPr>
-          <w:rFonts w:ascii="Times New Roman" w:hAnsi="Times New Roman" w:cs="Times New Roman"/>
-          <w:b w:val="0"/>
-          <w:i/>
-          <w:sz w:val="24"/>
-        </w:rPr>
-        <w:t>Penyebab kedua</w:t>
-      </w:r>
-      <w:r>
-        <w:rPr>
-          <w:rFonts w:ascii="Times New Roman" w:hAnsi="Times New Roman" w:cs="Times New Roman"/>
-          <w:b w:val="0"/>
-          <w:i w:val="0"/>
-          <w:sz w:val="24"/>
-        </w:rPr>
-        <w:t xml:space="preserve"> adalah transaksi yang melibatkan akun modal kerja tetapi tidak memengaruhi kas — misalnya penilaian naik/turun (</w:t>
-      </w:r>
-      <w:r>
-        <w:rPr>
-          <w:rFonts w:ascii="Times New Roman" w:hAnsi="Times New Roman" w:cs="Times New Roman"/>
-          <w:b w:val="0"/>
-          <w:i/>
-          <w:sz w:val="24"/>
-        </w:rPr>
-        <w:t>write-up/write-down</w:t>
-      </w:r>
-      <w:r>
-        <w:rPr>
-          <w:rFonts w:ascii="Times New Roman" w:hAnsi="Times New Roman" w:cs="Times New Roman"/>
-          <w:b w:val="0"/>
-          <w:i w:val="0"/>
-          <w:sz w:val="24"/>
-        </w:rPr>
-        <w:t xml:space="preserve">) pos modal kerja seperti persediaan ketika perusahaan diakuisisi melalui pembelian, alokasi penyusutan ke dalam persediaan yang diproduksi, serta reklasifikasi apa pun atas akun modal kerja antara kategori lancar dan tidak lancar (Wolk et al., 2017, PDF hlm. 10). </w:t>
-      </w:r>
-      <w:r>
-        <w:rPr>
-          <w:rFonts w:ascii="Times New Roman" w:hAnsi="Times New Roman" w:cs="Times New Roman"/>
-          <w:b w:val="0"/>
-          <w:i/>
-          <w:sz w:val="24"/>
-        </w:rPr>
-        <w:t>Penyebab ketiga</w:t>
-      </w:r>
-      <w:r>
-        <w:rPr>
-          <w:rFonts w:ascii="Times New Roman" w:hAnsi="Times New Roman" w:cs="Times New Roman"/>
-          <w:b w:val="0"/>
-          <w:i w:val="0"/>
-          <w:sz w:val="24"/>
-        </w:rPr>
-        <w:t xml:space="preserve"> adalah penggunaan satu akun utang usaha untuk pembelian aset modal kerja (persediaan, beban dibayar di muka) sekaligus aset non-modal-kerja (peralatan, tanah, paten); pembelian persediaan secara kredit tergolong aktivitas operasi sehingga menghasilkan penyesuaian modal kerja positif di bagian operasi, sedangkan pembelian peralatan secara kredit tergolong aktivitas investasi, sehingga perubahan saldo utang usaha di neraca tidak sama dengan penyesuaian utang usaha di bagian operasi (Wolk et al., 2017, PDF hlm. 10).</w:t>
+          <w:sz w:val="22"/>
+        </w:rPr>
+        <w:t>Sumber: Wolk, Dodd &amp; Rozycki (2017), Exhibit 13.4, PDF hlm. 10</w:t>
       </w:r>
     </w:p>
     <w:p>
@@ -3367,6 +3675,172 @@
           <w:i w:val="0"/>
           <w:sz w:val="24"/>
         </w:rPr>
+        <w:t xml:space="preserve">Bab ini mengidentifikasi tiga penyebab nonartikulasi. </w:t>
+      </w:r>
+      <w:r>
+        <w:rPr>
+          <w:rFonts w:ascii="Times New Roman" w:hAnsi="Times New Roman" w:cs="Times New Roman"/>
+          <w:b w:val="0"/>
+          <w:i/>
+          <w:sz w:val="24"/>
+        </w:rPr>
+        <w:t>Penyebab pertama</w:t>
+      </w:r>
+      <w:r>
+        <w:rPr>
+          <w:rFonts w:ascii="Times New Roman" w:hAnsi="Times New Roman" w:cs="Times New Roman"/>
+          <w:b w:val="0"/>
+          <w:i w:val="0"/>
+          <w:sz w:val="24"/>
+        </w:rPr>
+        <w:t xml:space="preserve"> adalah akuisisi anak perusahaan selama tahun berjalan: ketika sebuah perusahaan mengakuisisi anak perusahaan, saldo modal kerja awal tahun dari perusahaan yang diakuisisi tidak tercakup dalam neraca konsolidasi awal; agar berartikulasi, saldo-saldo yang hilang itu harus dimasukkan ke dalam saldo awal tahun perusahaan terkonsolidasi (Wolk et al., 2017, PDF hlm. 10). </w:t>
+      </w:r>
+      <w:r>
+        <w:rPr>
+          <w:rFonts w:ascii="Times New Roman" w:hAnsi="Times New Roman" w:cs="Times New Roman"/>
+          <w:b w:val="0"/>
+          <w:i/>
+          <w:sz w:val="24"/>
+        </w:rPr>
+        <w:t>Penyebab kedua</w:t>
+      </w:r>
+      <w:r>
+        <w:rPr>
+          <w:rFonts w:ascii="Times New Roman" w:hAnsi="Times New Roman" w:cs="Times New Roman"/>
+          <w:b w:val="0"/>
+          <w:i w:val="0"/>
+          <w:sz w:val="24"/>
+        </w:rPr>
+        <w:t xml:space="preserve"> adalah transaksi yang melibatkan akun modal kerja tetapi tidak memengaruhi kas — misalnya penilaian naik/turun (</w:t>
+      </w:r>
+      <w:r>
+        <w:rPr>
+          <w:rFonts w:ascii="Times New Roman" w:hAnsi="Times New Roman" w:cs="Times New Roman"/>
+          <w:b w:val="0"/>
+          <w:i/>
+          <w:sz w:val="24"/>
+        </w:rPr>
+        <w:t>write-up/write-down</w:t>
+      </w:r>
+      <w:r>
+        <w:rPr>
+          <w:rFonts w:ascii="Times New Roman" w:hAnsi="Times New Roman" w:cs="Times New Roman"/>
+          <w:b w:val="0"/>
+          <w:i w:val="0"/>
+          <w:sz w:val="24"/>
+        </w:rPr>
+        <w:t xml:space="preserve">) pos modal kerja seperti persediaan ketika perusahaan diakuisisi melalui pembelian, alokasi penyusutan ke dalam persediaan yang diproduksi, serta reklasifikasi apa pun atas akun modal kerja antara kategori lancar dan tidak lancar (Wolk et al., 2017, PDF hlm. 10). </w:t>
+      </w:r>
+      <w:r>
+        <w:rPr>
+          <w:rFonts w:ascii="Times New Roman" w:hAnsi="Times New Roman" w:cs="Times New Roman"/>
+          <w:b w:val="0"/>
+          <w:i/>
+          <w:sz w:val="24"/>
+        </w:rPr>
+        <w:t>Penyebab ketiga</w:t>
+      </w:r>
+      <w:r>
+        <w:rPr>
+          <w:rFonts w:ascii="Times New Roman" w:hAnsi="Times New Roman" w:cs="Times New Roman"/>
+          <w:b w:val="0"/>
+          <w:i w:val="0"/>
+          <w:sz w:val="24"/>
+        </w:rPr>
+        <w:t xml:space="preserve"> adalah penggunaan satu akun utang usaha untuk pembelian aset modal kerja (persediaan, beban dibayar di muka) sekaligus aset non-modal-kerja (peralatan, tanah, paten); pembelian persediaan secara kredit tergolong aktivitas operasi sehingga menghasilkan penyesuaian modal kerja positif di bagian operasi, sedangkan pembelian peralatan secara kredit tergolong aktivitas investasi, sehingga perubahan saldo utang usaha di neraca tidak sama dengan penyesuaian utang usaha di bagian operasi (Wolk et al., 2017, PDF hlm. 10).</w:t>
+      </w:r>
+    </w:p>
+    <w:p>
+      <w:pPr>
+        <w:spacing w:before="120" w:after="120"/>
+        <w:jc w:val="center"/>
+      </w:pPr>
+      <w:r>
+        <w:drawing>
+          <wp:inline xmlns:a="http://schemas.openxmlformats.org/drawingml/2006/main" xmlns:pic="http://schemas.openxmlformats.org/drawingml/2006/picture">
+            <wp:extent cx="5220000" cy="2272835"/>
+            <wp:docPr id="6" name="Picture 6"/>
+            <wp:cNvGraphicFramePr>
+              <a:graphicFrameLocks noChangeAspect="1"/>
+            </wp:cNvGraphicFramePr>
+            <a:graphic>
+              <a:graphicData uri="http://schemas.openxmlformats.org/drawingml/2006/picture">
+                <pic:pic>
+                  <pic:nvPicPr>
+                    <pic:cNvPr id="0" name="diagram-nonarticulation.png"/>
+                    <pic:cNvPicPr/>
+                  </pic:nvPicPr>
+                  <pic:blipFill>
+                    <a:blip r:embed="rId14"/>
+                    <a:stretch>
+                      <a:fillRect/>
+                    </a:stretch>
+                  </pic:blipFill>
+                  <pic:spPr>
+                    <a:xfrm>
+                      <a:off x="0" y="0"/>
+                      <a:ext cx="5220000" cy="2272835"/>
+                    </a:xfrm>
+                    <a:prstGeom prst="rect"/>
+                  </pic:spPr>
+                </pic:pic>
+              </a:graphicData>
+            </a:graphic>
+          </wp:inline>
+        </w:drawing>
+      </w:r>
+    </w:p>
+    <w:p>
+      <w:pPr>
+        <w:spacing w:lineRule="exact" w:line="360" w:before="0" w:after="0"/>
+        <w:jc w:val="center"/>
+      </w:pPr>
+      <w:r>
+        <w:rPr>
+          <w:rFonts w:ascii="Times New Roman" w:hAnsi="Times New Roman" w:cs="Times New Roman"/>
+          <w:b/>
+          <w:i w:val="0"/>
+          <w:sz w:val="22"/>
+        </w:rPr>
+        <w:t xml:space="preserve">Gambar 6. </w:t>
+      </w:r>
+      <w:r>
+        <w:rPr>
+          <w:rFonts w:ascii="Times New Roman" w:hAnsi="Times New Roman" w:cs="Times New Roman"/>
+          <w:b w:val="0"/>
+          <w:i w:val="0"/>
+          <w:sz w:val="22"/>
+        </w:rPr>
+        <w:t>Tiga penyebab nonartikulasi dan konsekuensinya</w:t>
+      </w:r>
+    </w:p>
+    <w:p>
+      <w:pPr>
+        <w:spacing w:lineRule="exact" w:line="360" w:before="0" w:after="240"/>
+        <w:jc w:val="center"/>
+      </w:pPr>
+      <w:r>
+        <w:rPr>
+          <w:rFonts w:ascii="Times New Roman" w:hAnsi="Times New Roman" w:cs="Times New Roman"/>
+          <w:b w:val="0"/>
+          <w:i/>
+          <w:sz w:val="22"/>
+        </w:rPr>
+        <w:t>Sumber: diolah dari Wolk, Dodd &amp; Rozycki (2017), PDF hlm. 9–10</w:t>
+      </w:r>
+    </w:p>
+    <w:p>
+      <w:pPr>
+        <w:spacing w:lineRule="exact" w:line="360" w:before="0" w:after="120"/>
+        <w:jc w:val="both"/>
+      </w:pPr>
+      <w:r>
+        <w:rPr>
+          <w:rFonts w:ascii="Times New Roman" w:hAnsi="Times New Roman" w:cs="Times New Roman"/>
+          <w:b w:val="0"/>
+          <w:i w:val="0"/>
+          <w:sz w:val="24"/>
+        </w:rPr>
         <w:t xml:space="preserve">Konsekuensi nonartikulasi bagi pengguna cukup serius: ia merusak kepercayaan terhadap koherensi laporan keuangan, karena pengguna yang berupaya menelusuri angka SCF kembali ke neraca akan menemukan ketidakcocokan yang tidak dapat mereka jelaskan tanpa informasi tambahan dari perusahaan. Sebagai perkembangan terkait, pada tahun </w:t>
       </w:r>
       <w:r>
@@ -4146,161 +4620,81 @@
     </w:p>
     <w:p>
       <w:pPr>
-        <w:spacing w:lineRule="exact" w:line="360" w:before="0" w:after="120"/>
-        <w:jc w:val="both"/>
+        <w:spacing w:before="120" w:after="120"/>
+        <w:jc w:val="center"/>
       </w:pPr>
       <w:r>
-        <w:rPr>
-          <w:rFonts w:ascii="Times New Roman" w:hAnsi="Times New Roman" w:cs="Times New Roman"/>
-          <w:b w:val="0"/>
-          <w:i w:val="0"/>
-          <w:sz w:val="24"/>
-        </w:rPr>
-        <w:t xml:space="preserve">Persoalan klasifikasi serupa muncul pula pada dua hal yang ditandai </w:t>
-      </w:r>
+        <w:drawing>
+          <wp:inline xmlns:a="http://schemas.openxmlformats.org/drawingml/2006/main" xmlns:pic="http://schemas.openxmlformats.org/drawingml/2006/picture">
+            <wp:extent cx="5220000" cy="3465860"/>
+            <wp:docPr id="7" name="Picture 7"/>
+            <wp:cNvGraphicFramePr>
+              <a:graphicFrameLocks noChangeAspect="1"/>
+            </wp:cNvGraphicFramePr>
+            <a:graphic>
+              <a:graphicData uri="http://schemas.openxmlformats.org/drawingml/2006/picture">
+                <pic:pic>
+                  <pic:nvPicPr>
+                    <pic:cNvPr id="0" name="exhibit-13-5.png"/>
+                    <pic:cNvPicPr/>
+                  </pic:nvPicPr>
+                  <pic:blipFill>
+                    <a:blip r:embed="rId15"/>
+                    <a:stretch>
+                      <a:fillRect/>
+                    </a:stretch>
+                  </pic:blipFill>
+                  <pic:spPr>
+                    <a:xfrm>
+                      <a:off x="0" y="0"/>
+                      <a:ext cx="5220000" cy="3465860"/>
+                    </a:xfrm>
+                    <a:prstGeom prst="rect"/>
+                  </pic:spPr>
+                </pic:pic>
+              </a:graphicData>
+            </a:graphic>
+          </wp:inline>
+        </w:drawing>
+      </w:r>
+    </w:p>
+    <w:p>
+      <w:pPr>
+        <w:spacing w:lineRule="exact" w:line="360" w:before="0" w:after="0"/>
+        <w:jc w:val="center"/>
+      </w:pPr>
       <w:r>
         <w:rPr>
           <w:rFonts w:ascii="Times New Roman" w:hAnsi="Times New Roman" w:cs="Times New Roman"/>
           <w:b/>
           <w:i w:val="0"/>
-          <w:sz w:val="24"/>
-        </w:rPr>
-        <w:t>Munter</w:t>
-      </w:r>
-      <w:r>
-        <w:rPr>
-          <w:rFonts w:ascii="Times New Roman" w:hAnsi="Times New Roman" w:cs="Times New Roman"/>
-          <w:b w:val="0"/>
-          <w:i w:val="0"/>
-          <w:sz w:val="24"/>
-        </w:rPr>
-        <w:t xml:space="preserve">. Pertama, apabila pembayaran bunga </w:t>
-      </w:r>
-      <w:r>
-        <w:rPr>
-          <w:rFonts w:ascii="Times New Roman" w:hAnsi="Times New Roman" w:cs="Times New Roman"/>
-          <w:b/>
-          <w:i w:val="0"/>
-          <w:sz w:val="24"/>
-        </w:rPr>
-        <w:t>dikapitalisasi</w:t>
-      </w:r>
-      <w:r>
-        <w:rPr>
-          <w:rFonts w:ascii="Times New Roman" w:hAnsi="Times New Roman" w:cs="Times New Roman"/>
-          <w:b w:val="0"/>
-          <w:i w:val="0"/>
-          <w:sz w:val="24"/>
-        </w:rPr>
-        <w:t xml:space="preserve"> menurut </w:t>
-      </w:r>
-      <w:r>
-        <w:rPr>
-          <w:rFonts w:ascii="Times New Roman" w:hAnsi="Times New Roman" w:cs="Times New Roman"/>
-          <w:b/>
-          <w:i w:val="0"/>
-          <w:sz w:val="24"/>
-        </w:rPr>
-        <w:t>SFAS No. 34</w:t>
-      </w:r>
-      <w:r>
-        <w:rPr>
-          <w:rFonts w:ascii="Times New Roman" w:hAnsi="Times New Roman" w:cs="Times New Roman"/>
-          <w:b w:val="0"/>
-          <w:i w:val="0"/>
-          <w:sz w:val="24"/>
-        </w:rPr>
-        <w:t xml:space="preserve">, bunga itu dikeluarkan dari aktivitas operasi dan dimasukkan ke aktivitas investasi sebagai bagian dari biaya perolehan aset tetap. Ini menimbulkan pertanyaan mendasar: apakah suatu peristiwa sebaiknya diklasifikasikan menurut </w:t>
-      </w:r>
-      <w:r>
-        <w:rPr>
-          <w:rFonts w:ascii="Times New Roman" w:hAnsi="Times New Roman" w:cs="Times New Roman"/>
-          <w:b/>
-          <w:i w:val="0"/>
-          <w:sz w:val="24"/>
-        </w:rPr>
-        <w:t>sifat dasarnya</w:t>
-      </w:r>
-      <w:r>
-        <w:rPr>
-          <w:rFonts w:ascii="Times New Roman" w:hAnsi="Times New Roman" w:cs="Times New Roman"/>
-          <w:b w:val="0"/>
-          <w:i w:val="0"/>
-          <w:sz w:val="24"/>
-        </w:rPr>
-        <w:t xml:space="preserve"> (</w:t>
-      </w:r>
+          <w:sz w:val="22"/>
+        </w:rPr>
+        <w:t xml:space="preserve">Gambar 7. </w:t>
+      </w:r>
+      <w:r>
+        <w:rPr>
+          <w:rFonts w:ascii="Times New Roman" w:hAnsi="Times New Roman" w:cs="Times New Roman"/>
+          <w:b w:val="0"/>
+          <w:i w:val="0"/>
+          <w:sz w:val="22"/>
+        </w:rPr>
+        <w:t>Empat metode alokasi premi obligasi (Exhibit 13.5)</w:t>
+      </w:r>
+    </w:p>
+    <w:p>
+      <w:pPr>
+        <w:spacing w:lineRule="exact" w:line="360" w:before="0" w:after="240"/>
+        <w:jc w:val="center"/>
+      </w:pPr>
       <w:r>
         <w:rPr>
           <w:rFonts w:ascii="Times New Roman" w:hAnsi="Times New Roman" w:cs="Times New Roman"/>
           <w:b w:val="0"/>
           <w:i/>
-          <w:sz w:val="24"/>
-        </w:rPr>
-        <w:t>basic nature</w:t>
-      </w:r>
-      <w:r>
-        <w:rPr>
-          <w:rFonts w:ascii="Times New Roman" w:hAnsi="Times New Roman" w:cs="Times New Roman"/>
-          <w:b w:val="0"/>
-          <w:i w:val="0"/>
-          <w:sz w:val="24"/>
-        </w:rPr>
-        <w:t xml:space="preserve"> — yakni pembayaran bunga) atau menurut </w:t>
-      </w:r>
-      <w:r>
-        <w:rPr>
-          <w:rFonts w:ascii="Times New Roman" w:hAnsi="Times New Roman" w:cs="Times New Roman"/>
-          <w:b/>
-          <w:i w:val="0"/>
-          <w:sz w:val="24"/>
-        </w:rPr>
-        <w:t>tujuan akhirnya</w:t>
-      </w:r>
-      <w:r>
-        <w:rPr>
-          <w:rFonts w:ascii="Times New Roman" w:hAnsi="Times New Roman" w:cs="Times New Roman"/>
-          <w:b w:val="0"/>
-          <w:i w:val="0"/>
-          <w:sz w:val="24"/>
-        </w:rPr>
-        <w:t xml:space="preserve"> (</w:t>
-      </w:r>
-      <w:r>
-        <w:rPr>
-          <w:rFonts w:ascii="Times New Roman" w:hAnsi="Times New Roman" w:cs="Times New Roman"/>
-          <w:b w:val="0"/>
-          <w:i/>
-          <w:sz w:val="24"/>
-        </w:rPr>
-        <w:t>ultimate purpose</w:t>
-      </w:r>
-      <w:r>
-        <w:rPr>
-          <w:rFonts w:ascii="Times New Roman" w:hAnsi="Times New Roman" w:cs="Times New Roman"/>
-          <w:b w:val="0"/>
-          <w:i w:val="0"/>
-          <w:sz w:val="24"/>
-        </w:rPr>
-        <w:t xml:space="preserve"> — yakni perolehan aset)? Kedua, pembagian yang serupa terjadi pada transaksi </w:t>
-      </w:r>
-      <w:r>
-        <w:rPr>
-          <w:rFonts w:ascii="Times New Roman" w:hAnsi="Times New Roman" w:cs="Times New Roman"/>
-          <w:b/>
-          <w:i w:val="0"/>
-          <w:sz w:val="24"/>
-        </w:rPr>
-        <w:t>sewa</w:t>
-      </w:r>
-      <w:r>
-        <w:rPr>
-          <w:rFonts w:ascii="Times New Roman" w:hAnsi="Times New Roman" w:cs="Times New Roman"/>
-          <w:b w:val="0"/>
-          <w:i w:val="0"/>
-          <w:sz w:val="24"/>
-        </w:rPr>
-        <w:t xml:space="preserve"> (sewa modal versus sewa operasi): untuk sewa operasi, seluruh pengeluaran kas diklasifikasikan sebagai arus keluar operasi; sedangkan untuk sewa modal, porsi bunga tergolong operasi dan pengurangan pokok tergolong pendanaan. Pertanyaan apakah sifat dasar atau tujuan akhir yang semestinya menjadi penentu tetap belum terjawab (Wolk et al., 2017, PDF hlm. 12).</w:t>
+          <w:sz w:val="22"/>
+        </w:rPr>
+        <w:t>Sumber: Wolk, Dodd &amp; Rozycki (2017), Exhibit 13.5, PDF hlm. 13</w:t>
       </w:r>
     </w:p>
     <w:p>
@@ -4315,6 +4709,165 @@
           <w:i w:val="0"/>
           <w:sz w:val="24"/>
         </w:rPr>
+        <w:t xml:space="preserve">Persoalan klasifikasi serupa muncul pula pada dua hal yang ditandai </w:t>
+      </w:r>
+      <w:r>
+        <w:rPr>
+          <w:rFonts w:ascii="Times New Roman" w:hAnsi="Times New Roman" w:cs="Times New Roman"/>
+          <w:b/>
+          <w:i w:val="0"/>
+          <w:sz w:val="24"/>
+        </w:rPr>
+        <w:t>Munter</w:t>
+      </w:r>
+      <w:r>
+        <w:rPr>
+          <w:rFonts w:ascii="Times New Roman" w:hAnsi="Times New Roman" w:cs="Times New Roman"/>
+          <w:b w:val="0"/>
+          <w:i w:val="0"/>
+          <w:sz w:val="24"/>
+        </w:rPr>
+        <w:t xml:space="preserve">. Pertama, apabila pembayaran bunga </w:t>
+      </w:r>
+      <w:r>
+        <w:rPr>
+          <w:rFonts w:ascii="Times New Roman" w:hAnsi="Times New Roman" w:cs="Times New Roman"/>
+          <w:b/>
+          <w:i w:val="0"/>
+          <w:sz w:val="24"/>
+        </w:rPr>
+        <w:t>dikapitalisasi</w:t>
+      </w:r>
+      <w:r>
+        <w:rPr>
+          <w:rFonts w:ascii="Times New Roman" w:hAnsi="Times New Roman" w:cs="Times New Roman"/>
+          <w:b w:val="0"/>
+          <w:i w:val="0"/>
+          <w:sz w:val="24"/>
+        </w:rPr>
+        <w:t xml:space="preserve"> menurut </w:t>
+      </w:r>
+      <w:r>
+        <w:rPr>
+          <w:rFonts w:ascii="Times New Roman" w:hAnsi="Times New Roman" w:cs="Times New Roman"/>
+          <w:b/>
+          <w:i w:val="0"/>
+          <w:sz w:val="24"/>
+        </w:rPr>
+        <w:t>SFAS No. 34</w:t>
+      </w:r>
+      <w:r>
+        <w:rPr>
+          <w:rFonts w:ascii="Times New Roman" w:hAnsi="Times New Roman" w:cs="Times New Roman"/>
+          <w:b w:val="0"/>
+          <w:i w:val="0"/>
+          <w:sz w:val="24"/>
+        </w:rPr>
+        <w:t xml:space="preserve">, bunga itu dikeluarkan dari aktivitas operasi dan dimasukkan ke aktivitas investasi sebagai bagian dari biaya perolehan aset tetap. Ini menimbulkan pertanyaan mendasar: apakah suatu peristiwa sebaiknya diklasifikasikan menurut </w:t>
+      </w:r>
+      <w:r>
+        <w:rPr>
+          <w:rFonts w:ascii="Times New Roman" w:hAnsi="Times New Roman" w:cs="Times New Roman"/>
+          <w:b/>
+          <w:i w:val="0"/>
+          <w:sz w:val="24"/>
+        </w:rPr>
+        <w:t>sifat dasarnya</w:t>
+      </w:r>
+      <w:r>
+        <w:rPr>
+          <w:rFonts w:ascii="Times New Roman" w:hAnsi="Times New Roman" w:cs="Times New Roman"/>
+          <w:b w:val="0"/>
+          <w:i w:val="0"/>
+          <w:sz w:val="24"/>
+        </w:rPr>
+        <w:t xml:space="preserve"> (</w:t>
+      </w:r>
+      <w:r>
+        <w:rPr>
+          <w:rFonts w:ascii="Times New Roman" w:hAnsi="Times New Roman" w:cs="Times New Roman"/>
+          <w:b w:val="0"/>
+          <w:i/>
+          <w:sz w:val="24"/>
+        </w:rPr>
+        <w:t>basic nature</w:t>
+      </w:r>
+      <w:r>
+        <w:rPr>
+          <w:rFonts w:ascii="Times New Roman" w:hAnsi="Times New Roman" w:cs="Times New Roman"/>
+          <w:b w:val="0"/>
+          <w:i w:val="0"/>
+          <w:sz w:val="24"/>
+        </w:rPr>
+        <w:t xml:space="preserve"> — yakni pembayaran bunga) atau menurut </w:t>
+      </w:r>
+      <w:r>
+        <w:rPr>
+          <w:rFonts w:ascii="Times New Roman" w:hAnsi="Times New Roman" w:cs="Times New Roman"/>
+          <w:b/>
+          <w:i w:val="0"/>
+          <w:sz w:val="24"/>
+        </w:rPr>
+        <w:t>tujuan akhirnya</w:t>
+      </w:r>
+      <w:r>
+        <w:rPr>
+          <w:rFonts w:ascii="Times New Roman" w:hAnsi="Times New Roman" w:cs="Times New Roman"/>
+          <w:b w:val="0"/>
+          <w:i w:val="0"/>
+          <w:sz w:val="24"/>
+        </w:rPr>
+        <w:t xml:space="preserve"> (</w:t>
+      </w:r>
+      <w:r>
+        <w:rPr>
+          <w:rFonts w:ascii="Times New Roman" w:hAnsi="Times New Roman" w:cs="Times New Roman"/>
+          <w:b w:val="0"/>
+          <w:i/>
+          <w:sz w:val="24"/>
+        </w:rPr>
+        <w:t>ultimate purpose</w:t>
+      </w:r>
+      <w:r>
+        <w:rPr>
+          <w:rFonts w:ascii="Times New Roman" w:hAnsi="Times New Roman" w:cs="Times New Roman"/>
+          <w:b w:val="0"/>
+          <w:i w:val="0"/>
+          <w:sz w:val="24"/>
+        </w:rPr>
+        <w:t xml:space="preserve"> — yakni perolehan aset)? Kedua, pembagian yang serupa terjadi pada transaksi </w:t>
+      </w:r>
+      <w:r>
+        <w:rPr>
+          <w:rFonts w:ascii="Times New Roman" w:hAnsi="Times New Roman" w:cs="Times New Roman"/>
+          <w:b/>
+          <w:i w:val="0"/>
+          <w:sz w:val="24"/>
+        </w:rPr>
+        <w:t>sewa</w:t>
+      </w:r>
+      <w:r>
+        <w:rPr>
+          <w:rFonts w:ascii="Times New Roman" w:hAnsi="Times New Roman" w:cs="Times New Roman"/>
+          <w:b w:val="0"/>
+          <w:i w:val="0"/>
+          <w:sz w:val="24"/>
+        </w:rPr>
+        <w:t xml:space="preserve"> (sewa modal versus sewa operasi): untuk sewa operasi, seluruh pengeluaran kas diklasifikasikan sebagai arus keluar operasi; sedangkan untuk sewa modal, porsi bunga tergolong operasi dan pengurangan pokok tergolong pendanaan. Pertanyaan apakah sifat dasar atau tujuan akhir yang semestinya menjadi penentu tetap belum terjawab (Wolk et al., 2017, PDF hlm. 12).</w:t>
+      </w:r>
+    </w:p>
+    <w:p>
+      <w:pPr>
+        <w:spacing w:lineRule="exact" w:line="360" w:before="0" w:after="120"/>
+        <w:jc w:val="both"/>
+      </w:pPr>
+      <w:r>
+        <w:rPr>
+          <w:rFonts w:ascii="Times New Roman" w:hAnsi="Times New Roman" w:cs="Times New Roman"/>
+          <w:b w:val="0"/>
+          <w:i w:val="0"/>
+          <w:sz w:val="24"/>
+        </w:rPr>
         <w:t>Dimensi terakhir masalah klasifikasi menyangkut keleluasaan penyajian yang diperluas. Dalam SFAS No. 95, aktivitas lindung nilai (</w:t>
       </w:r>
       <w:r>
@@ -4989,6 +5542,85 @@
     </w:p>
     <w:p>
       <w:pPr>
+        <w:spacing w:before="120" w:after="120"/>
+        <w:jc w:val="center"/>
+      </w:pPr>
+      <w:r>
+        <w:drawing>
+          <wp:inline xmlns:a="http://schemas.openxmlformats.org/drawingml/2006/main" xmlns:pic="http://schemas.openxmlformats.org/drawingml/2006/picture">
+            <wp:extent cx="5220000" cy="1749149"/>
+            <wp:docPr id="8" name="Picture 8"/>
+            <wp:cNvGraphicFramePr>
+              <a:graphicFrameLocks noChangeAspect="1"/>
+            </wp:cNvGraphicFramePr>
+            <a:graphic>
+              <a:graphicData uri="http://schemas.openxmlformats.org/drawingml/2006/picture">
+                <pic:pic>
+                  <pic:nvPicPr>
+                    <pic:cNvPr id="0" name="exhibit-13-6.png"/>
+                    <pic:cNvPicPr/>
+                  </pic:nvPicPr>
+                  <pic:blipFill>
+                    <a:blip r:embed="rId16"/>
+                    <a:stretch>
+                      <a:fillRect/>
+                    </a:stretch>
+                  </pic:blipFill>
+                  <pic:spPr>
+                    <a:xfrm>
+                      <a:off x="0" y="0"/>
+                      <a:ext cx="5220000" cy="1749149"/>
+                    </a:xfrm>
+                    <a:prstGeom prst="rect"/>
+                  </pic:spPr>
+                </pic:pic>
+              </a:graphicData>
+            </a:graphic>
+          </wp:inline>
+        </w:drawing>
+      </w:r>
+    </w:p>
+    <w:p>
+      <w:pPr>
+        <w:spacing w:lineRule="exact" w:line="360" w:before="0" w:after="0"/>
+        <w:jc w:val="center"/>
+      </w:pPr>
+      <w:r>
+        <w:rPr>
+          <w:rFonts w:ascii="Times New Roman" w:hAnsi="Times New Roman" w:cs="Times New Roman"/>
+          <w:b/>
+          <w:i w:val="0"/>
+          <w:sz w:val="22"/>
+        </w:rPr>
+        <w:t xml:space="preserve">Gambar 8. </w:t>
+      </w:r>
+      <w:r>
+        <w:rPr>
+          <w:rFonts w:ascii="Times New Roman" w:hAnsi="Times New Roman" w:cs="Times New Roman"/>
+          <w:b w:val="0"/>
+          <w:i w:val="0"/>
+          <w:sz w:val="22"/>
+        </w:rPr>
+        <w:t>Kinerja dan arus kas WorldCom (Exhibit 13.6)</w:t>
+      </w:r>
+    </w:p>
+    <w:p>
+      <w:pPr>
+        <w:spacing w:lineRule="exact" w:line="360" w:before="0" w:after="240"/>
+        <w:jc w:val="center"/>
+      </w:pPr>
+      <w:r>
+        <w:rPr>
+          <w:rFonts w:ascii="Times New Roman" w:hAnsi="Times New Roman" w:cs="Times New Roman"/>
+          <w:b w:val="0"/>
+          <w:i/>
+          <w:sz w:val="22"/>
+        </w:rPr>
+        <w:t>Sumber: Wolk, Dodd &amp; Rozycki (2017), Exhibit 13.6, PDF hlm. 16</w:t>
+      </w:r>
+    </w:p>
+    <w:p>
+      <w:pPr>
         <w:spacing w:lineRule="exact" w:line="360" w:before="0" w:after="120"/>
         <w:jc w:val="both"/>
       </w:pPr>
@@ -5568,107 +6200,81 @@
     </w:p>
     <w:p>
       <w:pPr>
-        <w:spacing w:lineRule="exact" w:line="360" w:before="0" w:after="120"/>
-        <w:jc w:val="both"/>
+        <w:spacing w:before="120" w:after="120"/>
+        <w:jc w:val="center"/>
       </w:pPr>
       <w:r>
-        <w:rPr>
-          <w:rFonts w:ascii="Times New Roman" w:hAnsi="Times New Roman" w:cs="Times New Roman"/>
-          <w:b w:val="0"/>
-          <w:i w:val="0"/>
-          <w:sz w:val="24"/>
-        </w:rPr>
-        <w:t xml:space="preserve">Karena FCF tidak terbaca langsung dari SCF, bab menyajikan jembatan eksplisit pada </w:t>
-      </w:r>
+        <w:drawing>
+          <wp:inline xmlns:a="http://schemas.openxmlformats.org/drawingml/2006/main" xmlns:pic="http://schemas.openxmlformats.org/drawingml/2006/picture">
+            <wp:extent cx="5220000" cy="5908680"/>
+            <wp:docPr id="9" name="Picture 9"/>
+            <wp:cNvGraphicFramePr>
+              <a:graphicFrameLocks noChangeAspect="1"/>
+            </wp:cNvGraphicFramePr>
+            <a:graphic>
+              <a:graphicData uri="http://schemas.openxmlformats.org/drawingml/2006/picture">
+                <pic:pic>
+                  <pic:nvPicPr>
+                    <pic:cNvPr id="0" name="exhibit-13-9.png"/>
+                    <pic:cNvPicPr/>
+                  </pic:nvPicPr>
+                  <pic:blipFill>
+                    <a:blip r:embed="rId17"/>
+                    <a:stretch>
+                      <a:fillRect/>
+                    </a:stretch>
+                  </pic:blipFill>
+                  <pic:spPr>
+                    <a:xfrm>
+                      <a:off x="0" y="0"/>
+                      <a:ext cx="5220000" cy="5908680"/>
+                    </a:xfrm>
+                    <a:prstGeom prst="rect"/>
+                  </pic:spPr>
+                </pic:pic>
+              </a:graphicData>
+            </a:graphic>
+          </wp:inline>
+        </w:drawing>
+      </w:r>
+    </w:p>
+    <w:p>
+      <w:pPr>
+        <w:spacing w:lineRule="exact" w:line="360" w:before="0" w:after="0"/>
+        <w:jc w:val="center"/>
+      </w:pPr>
       <w:r>
         <w:rPr>
           <w:rFonts w:ascii="Times New Roman" w:hAnsi="Times New Roman" w:cs="Times New Roman"/>
           <w:b/>
           <w:i w:val="0"/>
-          <w:sz w:val="24"/>
-        </w:rPr>
-        <w:t>Exhibit 13.10</w:t>
-      </w:r>
-      <w:r>
-        <w:rPr>
-          <w:rFonts w:ascii="Times New Roman" w:hAnsi="Times New Roman" w:cs="Times New Roman"/>
-          <w:b w:val="0"/>
-          <w:i w:val="0"/>
-          <w:sz w:val="24"/>
-        </w:rPr>
-        <w:t xml:space="preserve">. Titik tolaknya adalah arus kas operasi (CFO); kepadanya </w:t>
-      </w:r>
-      <w:r>
-        <w:rPr>
-          <w:rFonts w:ascii="Times New Roman" w:hAnsi="Times New Roman" w:cs="Times New Roman"/>
-          <w:b/>
-          <w:i w:val="0"/>
-          <w:sz w:val="24"/>
-        </w:rPr>
-        <w:t>ditambahkan</w:t>
-      </w:r>
-      <w:r>
-        <w:rPr>
-          <w:rFonts w:ascii="Times New Roman" w:hAnsi="Times New Roman" w:cs="Times New Roman"/>
-          <w:b w:val="0"/>
-          <w:i w:val="0"/>
-          <w:sz w:val="24"/>
-        </w:rPr>
-        <w:t xml:space="preserve"> beban bunga setelah pajak (untuk meniadakan efek pendanaan yang mengontaminasi CFO); lalu </w:t>
-      </w:r>
-      <w:r>
-        <w:rPr>
-          <w:rFonts w:ascii="Times New Roman" w:hAnsi="Times New Roman" w:cs="Times New Roman"/>
-          <w:b/>
-          <w:i w:val="0"/>
-          <w:sz w:val="24"/>
-        </w:rPr>
-        <w:t>dikurangi</w:t>
-      </w:r>
-      <w:r>
-        <w:rPr>
-          <w:rFonts w:ascii="Times New Roman" w:hAnsi="Times New Roman" w:cs="Times New Roman"/>
-          <w:b w:val="0"/>
-          <w:i w:val="0"/>
-          <w:sz w:val="24"/>
-        </w:rPr>
-        <w:t xml:space="preserve"> kenaikan kas operasi (karena kas operasi diperlakukan sebagai bagian dari modal yang diinvestasikan); dan </w:t>
-      </w:r>
-      <w:r>
-        <w:rPr>
-          <w:rFonts w:ascii="Times New Roman" w:hAnsi="Times New Roman" w:cs="Times New Roman"/>
-          <w:b/>
-          <w:i w:val="0"/>
-          <w:sz w:val="24"/>
-        </w:rPr>
-        <w:t>ditambahkan</w:t>
-      </w:r>
-      <w:r>
-        <w:rPr>
-          <w:rFonts w:ascii="Times New Roman" w:hAnsi="Times New Roman" w:cs="Times New Roman"/>
-          <w:b w:val="0"/>
-          <w:i w:val="0"/>
-          <w:sz w:val="24"/>
-        </w:rPr>
-        <w:t xml:space="preserve"> arus kas bersih dari aktivitas investasi (CFI). Satu kehati-hatian penting di sini: CFI lazimnya bernilai negatif — pada ABC tahun 2005, misalnya, CFI sebesar $(277) — sehingga "menambahkan" CFI sesungguhnya </w:t>
-      </w:r>
-      <w:r>
-        <w:rPr>
-          <w:rFonts w:ascii="Times New Roman" w:hAnsi="Times New Roman" w:cs="Times New Roman"/>
-          <w:b/>
-          <w:i w:val="0"/>
-          <w:sz w:val="24"/>
-        </w:rPr>
-        <w:t>mengurangi</w:t>
-      </w:r>
-      <w:r>
-        <w:rPr>
-          <w:rFonts w:ascii="Times New Roman" w:hAnsi="Times New Roman" w:cs="Times New Roman"/>
-          <w:b w:val="0"/>
-          <w:i w:val="0"/>
-          <w:sz w:val="24"/>
-        </w:rPr>
-        <w:t xml:space="preserve"> FCF. Hasil akhir jembatan ini, $332/99/80, identik dengan FCF yang dibangun pada Exhibit 13.9.</w:t>
+          <w:sz w:val="22"/>
+        </w:rPr>
+        <w:t xml:space="preserve">Gambar 9. </w:t>
+      </w:r>
+      <w:r>
+        <w:rPr>
+          <w:rFonts w:ascii="Times New Roman" w:hAnsi="Times New Roman" w:cs="Times New Roman"/>
+          <w:b w:val="0"/>
+          <w:i w:val="0"/>
+          <w:sz w:val="22"/>
+        </w:rPr>
+        <w:t>Konstruksi free cash flow ABC Company (Exhibit 13.9)</w:t>
+      </w:r>
+    </w:p>
+    <w:p>
+      <w:pPr>
+        <w:spacing w:lineRule="exact" w:line="360" w:before="0" w:after="240"/>
+        <w:jc w:val="center"/>
+      </w:pPr>
+      <w:r>
+        <w:rPr>
+          <w:rFonts w:ascii="Times New Roman" w:hAnsi="Times New Roman" w:cs="Times New Roman"/>
+          <w:b w:val="0"/>
+          <w:i/>
+          <w:sz w:val="22"/>
+        </w:rPr>
+        <w:t>Sumber: Wolk, Dodd &amp; Rozycki (2017), Exhibit 13.9, PDF hlm. 20</w:t>
       </w:r>
     </w:p>
     <w:p>
@@ -5683,6 +6289,190 @@
           <w:i w:val="0"/>
           <w:sz w:val="24"/>
         </w:rPr>
+        <w:t xml:space="preserve">Karena FCF tidak terbaca langsung dari SCF, bab menyajikan jembatan eksplisit pada </w:t>
+      </w:r>
+      <w:r>
+        <w:rPr>
+          <w:rFonts w:ascii="Times New Roman" w:hAnsi="Times New Roman" w:cs="Times New Roman"/>
+          <w:b/>
+          <w:i w:val="0"/>
+          <w:sz w:val="24"/>
+        </w:rPr>
+        <w:t>Exhibit 13.10</w:t>
+      </w:r>
+      <w:r>
+        <w:rPr>
+          <w:rFonts w:ascii="Times New Roman" w:hAnsi="Times New Roman" w:cs="Times New Roman"/>
+          <w:b w:val="0"/>
+          <w:i w:val="0"/>
+          <w:sz w:val="24"/>
+        </w:rPr>
+        <w:t xml:space="preserve">. Titik tolaknya adalah arus kas operasi (CFO); kepadanya </w:t>
+      </w:r>
+      <w:r>
+        <w:rPr>
+          <w:rFonts w:ascii="Times New Roman" w:hAnsi="Times New Roman" w:cs="Times New Roman"/>
+          <w:b/>
+          <w:i w:val="0"/>
+          <w:sz w:val="24"/>
+        </w:rPr>
+        <w:t>ditambahkan</w:t>
+      </w:r>
+      <w:r>
+        <w:rPr>
+          <w:rFonts w:ascii="Times New Roman" w:hAnsi="Times New Roman" w:cs="Times New Roman"/>
+          <w:b w:val="0"/>
+          <w:i w:val="0"/>
+          <w:sz w:val="24"/>
+        </w:rPr>
+        <w:t xml:space="preserve"> beban bunga setelah pajak (untuk meniadakan efek pendanaan yang mengontaminasi CFO); lalu </w:t>
+      </w:r>
+      <w:r>
+        <w:rPr>
+          <w:rFonts w:ascii="Times New Roman" w:hAnsi="Times New Roman" w:cs="Times New Roman"/>
+          <w:b/>
+          <w:i w:val="0"/>
+          <w:sz w:val="24"/>
+        </w:rPr>
+        <w:t>dikurangi</w:t>
+      </w:r>
+      <w:r>
+        <w:rPr>
+          <w:rFonts w:ascii="Times New Roman" w:hAnsi="Times New Roman" w:cs="Times New Roman"/>
+          <w:b w:val="0"/>
+          <w:i w:val="0"/>
+          <w:sz w:val="24"/>
+        </w:rPr>
+        <w:t xml:space="preserve"> kenaikan kas operasi (karena kas operasi diperlakukan sebagai bagian dari modal yang diinvestasikan); dan </w:t>
+      </w:r>
+      <w:r>
+        <w:rPr>
+          <w:rFonts w:ascii="Times New Roman" w:hAnsi="Times New Roman" w:cs="Times New Roman"/>
+          <w:b/>
+          <w:i w:val="0"/>
+          <w:sz w:val="24"/>
+        </w:rPr>
+        <w:t>ditambahkan</w:t>
+      </w:r>
+      <w:r>
+        <w:rPr>
+          <w:rFonts w:ascii="Times New Roman" w:hAnsi="Times New Roman" w:cs="Times New Roman"/>
+          <w:b w:val="0"/>
+          <w:i w:val="0"/>
+          <w:sz w:val="24"/>
+        </w:rPr>
+        <w:t xml:space="preserve"> arus kas bersih dari aktivitas investasi (CFI). Satu kehati-hatian penting di sini: CFI lazimnya bernilai negatif — pada ABC tahun 2005, misalnya, CFI sebesar $(277) — sehingga "menambahkan" CFI sesungguhnya </w:t>
+      </w:r>
+      <w:r>
+        <w:rPr>
+          <w:rFonts w:ascii="Times New Roman" w:hAnsi="Times New Roman" w:cs="Times New Roman"/>
+          <w:b/>
+          <w:i w:val="0"/>
+          <w:sz w:val="24"/>
+        </w:rPr>
+        <w:t>mengurangi</w:t>
+      </w:r>
+      <w:r>
+        <w:rPr>
+          <w:rFonts w:ascii="Times New Roman" w:hAnsi="Times New Roman" w:cs="Times New Roman"/>
+          <w:b w:val="0"/>
+          <w:i w:val="0"/>
+          <w:sz w:val="24"/>
+        </w:rPr>
+        <w:t xml:space="preserve"> FCF. Hasil akhir jembatan ini, $332/99/80, identik dengan FCF yang dibangun pada Exhibit 13.9.</w:t>
+      </w:r>
+    </w:p>
+    <w:p>
+      <w:pPr>
+        <w:spacing w:before="120" w:after="120"/>
+        <w:jc w:val="center"/>
+      </w:pPr>
+      <w:r>
+        <w:drawing>
+          <wp:inline xmlns:a="http://schemas.openxmlformats.org/drawingml/2006/main" xmlns:pic="http://schemas.openxmlformats.org/drawingml/2006/picture">
+            <wp:extent cx="5220000" cy="2505884"/>
+            <wp:docPr id="10" name="Picture 10"/>
+            <wp:cNvGraphicFramePr>
+              <a:graphicFrameLocks noChangeAspect="1"/>
+            </wp:cNvGraphicFramePr>
+            <a:graphic>
+              <a:graphicData uri="http://schemas.openxmlformats.org/drawingml/2006/picture">
+                <pic:pic>
+                  <pic:nvPicPr>
+                    <pic:cNvPr id="0" name="diagram-fcf-waterfall.png"/>
+                    <pic:cNvPicPr/>
+                  </pic:nvPicPr>
+                  <pic:blipFill>
+                    <a:blip r:embed="rId18"/>
+                    <a:stretch>
+                      <a:fillRect/>
+                    </a:stretch>
+                  </pic:blipFill>
+                  <pic:spPr>
+                    <a:xfrm>
+                      <a:off x="0" y="0"/>
+                      <a:ext cx="5220000" cy="2505884"/>
+                    </a:xfrm>
+                    <a:prstGeom prst="rect"/>
+                  </pic:spPr>
+                </pic:pic>
+              </a:graphicData>
+            </a:graphic>
+          </wp:inline>
+        </w:drawing>
+      </w:r>
+    </w:p>
+    <w:p>
+      <w:pPr>
+        <w:spacing w:lineRule="exact" w:line="360" w:before="0" w:after="0"/>
+        <w:jc w:val="center"/>
+      </w:pPr>
+      <w:r>
+        <w:rPr>
+          <w:rFonts w:ascii="Times New Roman" w:hAnsi="Times New Roman" w:cs="Times New Roman"/>
+          <w:b/>
+          <w:i w:val="0"/>
+          <w:sz w:val="22"/>
+        </w:rPr>
+        <w:t xml:space="preserve">Gambar 10. </w:t>
+      </w:r>
+      <w:r>
+        <w:rPr>
+          <w:rFonts w:ascii="Times New Roman" w:hAnsi="Times New Roman" w:cs="Times New Roman"/>
+          <w:b w:val="0"/>
+          <w:i w:val="0"/>
+          <w:sz w:val="22"/>
+        </w:rPr>
+        <w:t>Jembatan CFO menuju FCF, ABC Company 2005</w:t>
+      </w:r>
+    </w:p>
+    <w:p>
+      <w:pPr>
+        <w:spacing w:lineRule="exact" w:line="360" w:before="0" w:after="240"/>
+        <w:jc w:val="center"/>
+      </w:pPr>
+      <w:r>
+        <w:rPr>
+          <w:rFonts w:ascii="Times New Roman" w:hAnsi="Times New Roman" w:cs="Times New Roman"/>
+          <w:b w:val="0"/>
+          <w:i/>
+          <w:sz w:val="22"/>
+        </w:rPr>
+        <w:t>Sumber: diolah dari Wolk, Dodd &amp; Rozycki (2017), Exhibit 13.10, PDF hlm. 20</w:t>
+      </w:r>
+    </w:p>
+    <w:p>
+      <w:pPr>
+        <w:spacing w:lineRule="exact" w:line="360" w:before="0" w:after="120"/>
+        <w:jc w:val="both"/>
+      </w:pPr>
+      <w:r>
+        <w:rPr>
+          <w:rFonts w:ascii="Times New Roman" w:hAnsi="Times New Roman" w:cs="Times New Roman"/>
+          <w:b w:val="0"/>
+          <w:i w:val="0"/>
+          <w:sz w:val="24"/>
+        </w:rPr>
         <w:t xml:space="preserve">Bab menutup pembahasan FCF dengan panduan empat ukuran yang dirangkum pada </w:t>
       </w:r>
       <w:r>
@@ -5828,6 +6618,85 @@
           <w:sz w:val="24"/>
         </w:rPr>
         <w:t>, WACC) perusahaan (Wolk et al., 2017, PDF hlm. 18). Perbandingan keempat ukuran untuk ABC memperlihatkan betapa ragamnya gambaran yang dihasilkan: laba bersih $320/312/331; CFO $527/466/434; CFO − CFI $250/157/74; dan FCF $332/99/80 — sebuah keragaman yang ditutup bab dengan kalimat bijak bahwa "dunia nyata tidak pernah sederhana" (Wolk et al., 2017, PDF hlm. 19, 21). Perlu dicatat, FCF merupakan ukuran non-GAAP; ia tidak diatur secara seragam, tumbuh sebagian justru karena keterbatasan SCF, dan karenanya menuntut kehati-hatian — angkanya bergantung pada definisi yang dipilih serta asumsi yang melekat pada estimasi arus kas masa depan.</w:t>
+      </w:r>
+    </w:p>
+    <w:p>
+      <w:pPr>
+        <w:spacing w:before="120" w:after="120"/>
+        <w:jc w:val="center"/>
+      </w:pPr>
+      <w:r>
+        <w:drawing>
+          <wp:inline xmlns:a="http://schemas.openxmlformats.org/drawingml/2006/main" xmlns:pic="http://schemas.openxmlformats.org/drawingml/2006/picture">
+            <wp:extent cx="5220000" cy="2427797"/>
+            <wp:docPr id="11" name="Picture 11"/>
+            <wp:cNvGraphicFramePr>
+              <a:graphicFrameLocks noChangeAspect="1"/>
+            </wp:cNvGraphicFramePr>
+            <a:graphic>
+              <a:graphicData uri="http://schemas.openxmlformats.org/drawingml/2006/picture">
+                <pic:pic>
+                  <pic:nvPicPr>
+                    <pic:cNvPr id="0" name="diagram-four-measures.png"/>
+                    <pic:cNvPicPr/>
+                  </pic:nvPicPr>
+                  <pic:blipFill>
+                    <a:blip r:embed="rId19"/>
+                    <a:stretch>
+                      <a:fillRect/>
+                    </a:stretch>
+                  </pic:blipFill>
+                  <pic:spPr>
+                    <a:xfrm>
+                      <a:off x="0" y="0"/>
+                      <a:ext cx="5220000" cy="2427797"/>
+                    </a:xfrm>
+                    <a:prstGeom prst="rect"/>
+                  </pic:spPr>
+                </pic:pic>
+              </a:graphicData>
+            </a:graphic>
+          </wp:inline>
+        </w:drawing>
+      </w:r>
+    </w:p>
+    <w:p>
+      <w:pPr>
+        <w:spacing w:lineRule="exact" w:line="360" w:before="0" w:after="0"/>
+        <w:jc w:val="center"/>
+      </w:pPr>
+      <w:r>
+        <w:rPr>
+          <w:rFonts w:ascii="Times New Roman" w:hAnsi="Times New Roman" w:cs="Times New Roman"/>
+          <w:b/>
+          <w:i w:val="0"/>
+          <w:sz w:val="22"/>
+        </w:rPr>
+        <w:t xml:space="preserve">Gambar 11. </w:t>
+      </w:r>
+      <w:r>
+        <w:rPr>
+          <w:rFonts w:ascii="Times New Roman" w:hAnsi="Times New Roman" w:cs="Times New Roman"/>
+          <w:b w:val="0"/>
+          <w:i w:val="0"/>
+          <w:sz w:val="22"/>
+        </w:rPr>
+        <w:t>Perbandingan empat ukuran kinerja ABC Company</w:t>
+      </w:r>
+    </w:p>
+    <w:p>
+      <w:pPr>
+        <w:spacing w:lineRule="exact" w:line="360" w:before="0" w:after="240"/>
+        <w:jc w:val="center"/>
+      </w:pPr>
+      <w:r>
+        <w:rPr>
+          <w:rFonts w:ascii="Times New Roman" w:hAnsi="Times New Roman" w:cs="Times New Roman"/>
+          <w:b w:val="0"/>
+          <w:i/>
+          <w:sz w:val="22"/>
+        </w:rPr>
+        <w:t>Sumber: diolah dari Wolk, Dodd &amp; Rozycki (2017), Exhibit 13.11, PDF hlm. 18, 21</w:t>
       </w:r>
     </w:p>
     <w:p>

</xml_diff>